<commit_message>
Reconcile the design docs with the SSOT
APB peripherals are on pclk, the DMA does reach ISRAM, and DMA channel 4
serves the SPI slave again per ADR-0020 Rev 2.
</commit_message>
<xml_diff>
--- a/Design_Docs/GARUDA-ADR-001.docx
+++ b/Design_Docs/GARUDA-ADR-001.docx
@@ -2,7 +2,7 @@
 <file path=word/document.xml><?xml version="1.0" encoding="utf-8"?>
 <w:document xmlns:w="http://schemas.openxmlformats.org/wordprocessingml/2006/main" xmlns:m="http://schemas.openxmlformats.org/officeDocument/2006/math" xmlns:r="http://schemas.openxmlformats.org/officeDocument/2006/relationships" xmlns:o="urn:schemas-microsoft-com:office:office" xmlns:v="urn:schemas-microsoft-com:vml" xmlns:w10="urn:schemas-microsoft-com:office:word" xmlns:a="http://schemas.openxmlformats.org/drawingml/2006/main" xmlns:pic="http://schemas.openxmlformats.org/drawingml/2006/picture" xmlns:wp="http://schemas.openxmlformats.org/drawingml/2006/wordprocessingDrawing">
   <w:body>
-    <w:bookmarkStart w:id="43" w:name="X038d12706579a8b5cfe29ae180348a8a91701d9"/>
+    <w:bookmarkStart w:id="45" w:name="X9ab06b113ba48c95dd39ff6f4a84b89ec032684"/>
     <w:p>
       <w:pPr>
         <w:pStyle w:val="Heading1"/>
@@ -226,7 +226,7 @@
         </w:pict>
       </w:r>
     </w:p>
-    <w:bookmarkStart w:id="20" w:name="X1214f7d64d38a2cea38e793287800e71d0849f0"/>
+    <w:bookmarkStart w:id="21" w:name="X32f2987c20b85541ee1851edffa398a43c5607b"/>
     <w:p>
       <w:pPr>
         <w:pStyle w:val="Heading2"/>
@@ -352,7 +352,7 @@
         <w:t xml:space="preserve"> </w:t>
       </w:r>
       <w:r>
-        <w:t xml:space="preserve">the programme’s reference offers, on a tape-out whose point is partly to demonstrate the</w:t>
+        <w:t xml:space="preserve">the programme's reference offers, on a tape-out whose point is partly to demonstrate the</w:t>
       </w:r>
       <w:r>
         <w:t xml:space="preserve"> </w:t>
@@ -426,15 +426,15 @@
         </w:rPr>
         <w:t xml:space="preserve">Consequences that need separate ownership.</w:t>
       </w:r>
-      <w:r>
-        <w:t xml:space="preserve"> </w:t>
-      </w:r>
-      <w:r>
-        <w:t xml:space="preserve">1.</w:t>
-      </w:r>
-      <w:r>
-        <w:t xml:space="preserve"> </w:t>
-      </w:r>
+    </w:p>
+    <w:p>
+      <w:pPr>
+        <w:numPr>
+          <w:ilvl w:val="0"/>
+          <w:numId w:val="1001"/>
+        </w:numPr>
+        <w:pStyle w:val="Compact"/>
+      </w:pPr>
       <w:r>
         <w:rPr>
           <w:bCs/>
@@ -464,7 +464,7 @@
         <w:t xml:space="preserve"> </w:t>
       </w:r>
       <w:r>
-        <w:t xml:space="preserve">the pad’s own insertion delay and duty distortion become part of the clock budget. This</w:t>
+        <w:t xml:space="preserve">the pad's own insertion delay and duty distortion become part of the clock budget. This</w:t>
       </w:r>
       <w:r>
         <w:t xml:space="preserve"> </w:t>
@@ -478,15 +478,15 @@
       <w:r>
         <w:t xml:space="preserve">nobody in this project currently owns. Tracked as OPEN-5.</w:t>
       </w:r>
-      <w:r>
-        <w:t xml:space="preserve"> </w:t>
-      </w:r>
-      <w:r>
-        <w:t xml:space="preserve">2.</w:t>
-      </w:r>
-      <w:r>
-        <w:t xml:space="preserve"> </w:t>
-      </w:r>
+    </w:p>
+    <w:p>
+      <w:pPr>
+        <w:numPr>
+          <w:ilvl w:val="0"/>
+          <w:numId w:val="1001"/>
+        </w:numPr>
+        <w:pStyle w:val="Compact"/>
+      </w:pPr>
       <w:r>
         <w:rPr>
           <w:bCs/>
@@ -504,7 +504,7 @@
         <w:t xml:space="preserve">clk_div</w:t>
       </w:r>
       <w:r>
-        <w:t xml:space="preserve">’s single toggle flop sees</w:t>
+        <w:t xml:space="preserve">'s single toggle flop sees</w:t>
       </w:r>
       <w:r>
         <w:t xml:space="preserve"> </w:t>
@@ -524,15 +524,15 @@
       <w:r>
         <w:t xml:space="preserve">inherited from the hclk constraint set. Tracked as OPEN-6.</w:t>
       </w:r>
-      <w:r>
-        <w:t xml:space="preserve"> </w:t>
-      </w:r>
-      <w:r>
-        <w:t xml:space="preserve">3.</w:t>
-      </w:r>
-      <w:r>
-        <w:t xml:space="preserve"> </w:t>
-      </w:r>
+    </w:p>
+    <w:p>
+      <w:pPr>
+        <w:numPr>
+          <w:ilvl w:val="0"/>
+          <w:numId w:val="1001"/>
+        </w:numPr>
+        <w:pStyle w:val="Compact"/>
+      </w:pPr>
       <w:r>
         <w:rPr>
           <w:bCs/>
@@ -550,7 +550,7 @@
         <w:t xml:space="preserve"> </w:t>
       </w:r>
       <w:r>
-        <w:t xml:space="preserve">makes OPEN-1 (each IP’s maximum frequency) blocking rather than advisory. The remedy if</w:t>
+        <w:t xml:space="preserve">makes OPEN-1 (each IP's maximum frequency) blocking rather than advisory. The remedy if</w:t>
       </w:r>
       <w:r>
         <w:t xml:space="preserve"> </w:t>
@@ -567,6 +567,36 @@
     </w:p>
     <w:p>
       <w:pPr>
+        <w:pStyle w:val="FirstParagraph"/>
+      </w:pPr>
+      <w:r>
+        <w:rPr>
+          <w:bCs/>
+          <w:b/>
+        </w:rPr>
+        <w:t xml:space="preserve">Rejected.</w:t>
+      </w:r>
+      <w:r>
+        <w:t xml:space="preserve"> </w:t>
+      </w:r>
+      <w:r>
+        <w:t xml:space="preserve">A PLL: the reference already exceeds the target, and a PLL is a</w:t>
+      </w:r>
+      <w:r>
+        <w:t xml:space="preserve"> </w:t>
+      </w:r>
+      <w:r>
+        <w:t xml:space="preserve">mixed-signal IP dependency with its own lock, jitter and bring-up risk for no gain.</w:t>
+      </w:r>
+      <w:r>
+        <w:t xml:space="preserve"> </w:t>
+      </w:r>
+      <w:r>
+        <w:t xml:space="preserve">Non-power-of-2 division: 500 → 200 MHz needs 2.5×, and 250 MHz avoids the question.</w:t>
+      </w:r>
+    </w:p>
+    <w:p>
+      <w:pPr>
         <w:pStyle w:val="BodyText"/>
       </w:pPr>
       <w:r>
@@ -574,25 +604,283 @@
           <w:bCs/>
           <w:b/>
         </w:rPr>
-        <w:t xml:space="preserve">Rejected.</w:t>
-      </w:r>
-      <w:r>
-        <w:t xml:space="preserve"> </w:t>
-      </w:r>
-      <w:r>
-        <w:t xml:space="preserve">A PLL: the reference already exceeds the target, and a PLL is a</w:t>
-      </w:r>
-      <w:r>
-        <w:t xml:space="preserve"> </w:t>
-      </w:r>
-      <w:r>
-        <w:t xml:space="preserve">mixed-signal IP dependency with its own lock, jitter and bring-up risk for no gain.</w:t>
-      </w:r>
-      <w:r>
-        <w:t xml:space="preserve"> </w:t>
-      </w:r>
-      <w:r>
-        <w:t xml:space="preserve">Non-power-of-2 division: 500 → 200 MHz needs 2.5×, and 250 MHz avoids the question.</w:t>
+        <w:t xml:space="preserve">Impact.</w:t>
+      </w:r>
+      <w:r>
+        <w:t xml:space="preserve"> </w:t>
+      </w:r>
+      <w:r>
+        <w:t xml:space="preserve">CLKRST (DIV and the fallback), CORE, AHB2APB (OPEN-1), TRM. RTL: no logic</w:t>
+      </w:r>
+      <w:r>
+        <w:t xml:space="preserve"> </w:t>
+      </w:r>
+      <w:r>
+        <w:t xml:space="preserve">change;</w:t>
+      </w:r>
+      <w:r>
+        <w:t xml:space="preserve"> </w:t>
+      </w:r>
+      <w:r>
+        <w:rPr>
+          <w:rStyle w:val="VerbatimChar"/>
+        </w:rPr>
+        <w:t xml:space="preserve">garuda_soc_top.v</w:t>
+      </w:r>
+      <w:r>
+        <w:t xml:space="preserve">'s 200/100 MHz comments are stale against the generated header.</w:t>
+      </w:r>
+    </w:p>
+    <w:p>
+      <w:pPr>
+        <w:pStyle w:val="Heading2"/>
+      </w:pPr>
+      <w:bookmarkStart w:id="20" w:name="Xb3dcdd1cf128aed56cf7b6fe36482ba5341eb96"/>
+      <w:r>
+        <w:t xml:space="preserve">ADR-0002 — pclk restored: 125 MHz toggle-flop for peripheral power (Rev 2)</w:t>
+      </w:r>
+      <w:bookmarkEnd w:id="20"/>
+    </w:p>
+    <w:p>
+      <w:pPr>
+        <w:pStyle w:val="BlockText"/>
+      </w:pPr>
+      <w:r>
+        <w:rPr>
+          <w:bCs/>
+          <w:b/>
+        </w:rPr>
+        <w:t xml:space="preserve">Rev 2 (current) — pclk is KEPT.</w:t>
+      </w:r>
+      <w:r>
+        <w:t xml:space="preserve"> </w:t>
+      </w:r>
+      <w:r>
+        <w:t xml:space="preserve">Reverses Rev 1's removal. pclk exists as a real</w:t>
+      </w:r>
+      <w:r>
+        <w:t xml:space="preserve"> </w:t>
+      </w:r>
+      <w:r>
+        <w:t xml:space="preserve">125 MHz clock (hclk / 2, toggle flop, 50% duty), generated in</w:t>
+      </w:r>
+      <w:r>
+        <w:t xml:space="preserve"> </w:t>
+      </w:r>
+      <w:r>
+        <w:rPr>
+          <w:rStyle w:val="VerbatimChar"/>
+        </w:rPr>
+        <w:t xml:space="preserve">clk_div</w:t>
+      </w:r>
+      <w:r>
+        <w:t xml:space="preserve"> </w:t>
+      </w:r>
+      <w:r>
+        <w:t xml:space="preserve">(</w:t>
+      </w:r>
+      <w:r>
+        <w:rPr>
+          <w:rStyle w:val="VerbatimChar"/>
+        </w:rPr>
+        <w:t xml:space="preserve">pclk_o</w:t>
+      </w:r>
+      <w:r>
+        <w:t xml:space="preserve">,</w:t>
+      </w:r>
+      <w:r>
+        <w:t xml:space="preserve"> </w:t>
+      </w:r>
+      <w:r>
+        <w:rPr>
+          <w:rStyle w:val="VerbatimChar"/>
+        </w:rPr>
+        <w:t xml:space="preserve">Docs/DECISIONS.md D-5</w:t>
+      </w:r>
+      <w:r>
+        <w:t xml:space="preserve">). It clocks the 11 APB peripherals, the APB fabric, and the DMA</w:t>
+      </w:r>
+      <w:r>
+        <w:t xml:space="preserve"> </w:t>
+      </w:r>
+      <w:r>
+        <w:t xml:space="preserve">config port (APB window 4). hclk and pclk are a synchronous set - every pclk rising edge</w:t>
+      </w:r>
+      <w:r>
+        <w:t xml:space="preserve"> </w:t>
+      </w:r>
+      <w:r>
+        <w:t xml:space="preserve">is an hclk rising edge (</w:t>
+      </w:r>
+      <w:r>
+        <w:rPr>
+          <w:rStyle w:val="VerbatimChar"/>
+        </w:rPr>
+        <w:t xml:space="preserve">AHB2APB §7.2</w:t>
+      </w:r>
+      <w:r>
+        <w:t xml:space="preserve">), so there is NO CDC.</w:t>
+      </w:r>
+      <w:r>
+        <w:t xml:space="preserve"> </w:t>
+      </w:r>
+      <w:r>
+        <w:rPr>
+          <w:bCs/>
+          <w:b/>
+        </w:rPr>
+        <w:t xml:space="preserve">Reason:</w:t>
+      </w:r>
+      <w:r>
+        <w:t xml:space="preserve"> </w:t>
+      </w:r>
+      <w:r>
+        <w:t xml:space="preserve">without a real</w:t>
+      </w:r>
+      <w:r>
+        <w:t xml:space="preserve"> </w:t>
+      </w:r>
+      <w:r>
+        <w:t xml:space="preserve">pclk, peripheral flops toggle at 250 MHz through idle and save no power; a real half-rate</w:t>
+      </w:r>
+      <w:r>
+        <w:t xml:space="preserve"> </w:t>
+      </w:r>
+      <w:r>
+        <w:t xml:space="preserve">clock stops them (Level 3 dynamic power). The DMA</w:t>
+      </w:r>
+      <w:r>
+        <w:t xml:space="preserve"> </w:t>
+      </w:r>
+      <w:r>
+        <w:rPr>
+          <w:iCs/>
+          <w:i/>
+        </w:rPr>
+        <w:t xml:space="preserve">data engine</w:t>
+      </w:r>
+      <w:r>
+        <w:t xml:space="preserve"> </w:t>
+      </w:r>
+      <w:r>
+        <w:t xml:space="preserve">stays an hclk AHB master;</w:t>
+      </w:r>
+      <w:r>
+        <w:t xml:space="preserve"> </w:t>
+      </w:r>
+      <w:r>
+        <w:t xml:space="preserve">only its</w:t>
+      </w:r>
+      <w:r>
+        <w:t xml:space="preserve"> </w:t>
+      </w:r>
+      <w:r>
+        <w:rPr>
+          <w:iCs/>
+          <w:i/>
+        </w:rPr>
+        <w:t xml:space="preserve">config port</w:t>
+      </w:r>
+      <w:r>
+        <w:t xml:space="preserve"> </w:t>
+      </w:r>
+      <w:r>
+        <w:t xml:space="preserve">is pclk.</w:t>
+      </w:r>
+      <w:r>
+        <w:t xml:space="preserve"> </w:t>
+      </w:r>
+      <w:r>
+        <w:rPr>
+          <w:bCs/>
+          <w:b/>
+        </w:rPr>
+        <w:t xml:space="preserve">RTL status:</w:t>
+      </w:r>
+      <w:r>
+        <w:t xml:space="preserve"> </w:t>
+      </w:r>
+      <w:r>
+        <w:rPr>
+          <w:rStyle w:val="VerbatimChar"/>
+        </w:rPr>
+        <w:t xml:space="preserve">clk_div</w:t>
+      </w:r>
+      <w:r>
+        <w:t xml:space="preserve"> </w:t>
+      </w:r>
+      <w:r>
+        <w:t xml:space="preserve">already generates pclk;</w:t>
+      </w:r>
+      <w:r>
+        <w:t xml:space="preserve"> </w:t>
+      </w:r>
+      <w:r>
+        <w:rPr>
+          <w:rStyle w:val="VerbatimChar"/>
+        </w:rPr>
+        <w:t xml:space="preserve">dma_apb_slave.v</w:t>
+      </w:r>
+      <w:r>
+        <w:t xml:space="preserve"> </w:t>
+      </w:r>
+      <w:r>
+        <w:t xml:space="preserve">still runs on hclk and is the one pending RTL change.</w:t>
+      </w:r>
+    </w:p>
+    <w:p>
+      <w:pPr>
+        <w:pStyle w:val="BlockText"/>
+      </w:pPr>
+      <w:r>
+        <w:t xml:space="preserve">The Rev 1 text below is retained as history and is</w:t>
+      </w:r>
+      <w:r>
+        <w:t xml:space="preserve"> </w:t>
+      </w:r>
+      <w:r>
+        <w:rPr>
+          <w:bCs/>
+          <w:b/>
+        </w:rPr>
+        <w:t xml:space="preserve">SUPERSEDED</w:t>
+      </w:r>
+      <w:r>
+        <w:t xml:space="preserve">.</w:t>
+      </w:r>
+    </w:p>
+    <w:bookmarkEnd w:id="21"/>
+    <w:bookmarkStart w:id="22" w:name="Xa853b2856942858627868c7c02f49d7cad8b2f5"/>
+    <w:p>
+      <w:pPr>
+        <w:pStyle w:val="Heading2"/>
+      </w:pPr>
+      <w:r>
+        <w:t xml:space="preserve">ADR-0002 [SUPERSEDED Rev 1] — There is no pclk. APB runs on hclk.</w:t>
+      </w:r>
+    </w:p>
+    <w:p>
+      <w:pPr>
+        <w:pStyle w:val="FirstParagraph"/>
+      </w:pPr>
+      <w:r>
+        <w:rPr>
+          <w:bCs/>
+          <w:b/>
+        </w:rPr>
+        <w:t xml:space="preserve">Supersedes:</w:t>
+      </w:r>
+      <w:r>
+        <w:t xml:space="preserve"> </w:t>
+      </w:r>
+      <w:r>
+        <w:t xml:space="preserve">AHB2APB Rev 1.4 §7 (pclk = hclk through an ICG at 125 MHz) and DMA</w:t>
+      </w:r>
+      <w:r>
+        <w:t xml:space="preserve"> </w:t>
+      </w:r>
+      <w:r>
+        <w:t xml:space="preserve">§15.3 (real CDC primitives on the config port).</w:t>
       </w:r>
     </w:p>
     <w:p>
@@ -604,41 +892,148 @@
           <w:bCs/>
           <w:b/>
         </w:rPr>
-        <w:t xml:space="preserve">Impact.</w:t>
-      </w:r>
-      <w:r>
-        <w:t xml:space="preserve"> </w:t>
-      </w:r>
-      <w:r>
-        <w:t xml:space="preserve">CLKRST (DIV and the fallback), CORE, AHB2APB (OPEN-1), TRM. RTL: no logic</w:t>
-      </w:r>
-      <w:r>
-        <w:t xml:space="preserve"> </w:t>
-      </w:r>
-      <w:r>
-        <w:t xml:space="preserve">change;</w:t>
-      </w:r>
-      <w:r>
-        <w:t xml:space="preserve"> </w:t>
-      </w:r>
-      <w:r>
-        <w:rPr>
-          <w:rStyle w:val="VerbatimChar"/>
-        </w:rPr>
-        <w:t xml:space="preserve">garuda_soc_top.v</w:t>
-      </w:r>
-      <w:r>
-        <w:t xml:space="preserve">’s 200/100 MHz comments are stale against the generated header.</w:t>
-      </w:r>
-    </w:p>
-    <w:bookmarkEnd w:id="20"/>
-    <w:bookmarkStart w:id="21" w:name="X6932a0deb90652a4b322a4d3e5605bcc6a42e1f"/>
-    <w:p>
-      <w:pPr>
-        <w:pStyle w:val="Heading2"/>
-      </w:pPr>
-      <w:r>
-        <w:t xml:space="preserve">ADR-0002 — There is no pclk. APB runs on hclk.</w:t>
+        <w:t xml:space="preserve">Decision.</w:t>
+      </w:r>
+      <w:r>
+        <w:t xml:space="preserve"> </w:t>
+      </w:r>
+      <w:r>
+        <w:t xml:space="preserve">One functional clock in the chip. The bridge holds APB timing with</w:t>
+      </w:r>
+      <w:r>
+        <w:t xml:space="preserve"> </w:t>
+      </w:r>
+      <w:r>
+        <w:t xml:space="preserve">PSEL/PENABLE phases on hclk. No clock gate, no generated clock, no</w:t>
+      </w:r>
+      <w:r>
+        <w:t xml:space="preserve"> </w:t>
+      </w:r>
+      <w:r>
+        <w:rPr>
+          <w:rStyle w:val="VerbatimChar"/>
+        </w:rPr>
+        <w:t xml:space="preserve">pclk_o</w:t>
+      </w:r>
+      <w:r>
+        <w:t xml:space="preserve"> </w:t>
+      </w:r>
+      <w:r>
+        <w:t xml:space="preserve">port, no</w:t>
+      </w:r>
+      <w:r>
+        <w:t xml:space="preserve"> </w:t>
+      </w:r>
+      <w:r>
+        <w:rPr>
+          <w:rStyle w:val="VerbatimChar"/>
+        </w:rPr>
+        <w:t xml:space="preserve">preset_n</w:t>
+      </w:r>
+      <w:r>
+        <w:t xml:space="preserve">. The DMA's config port is an hclk APB slave and its gray-code counter,</w:t>
+      </w:r>
+      <w:r>
+        <w:t xml:space="preserve"> </w:t>
+      </w:r>
+      <w:r>
+        <w:t xml:space="preserve">toggle-handshake and level synchronisers are removed.</w:t>
+      </w:r>
+    </w:p>
+    <w:p>
+      <w:pPr>
+        <w:pStyle w:val="BodyText"/>
+      </w:pPr>
+      <w:r>
+        <w:rPr>
+          <w:bCs/>
+          <w:b/>
+        </w:rPr>
+        <w:t xml:space="preserve">Why.</w:t>
+      </w:r>
+    </w:p>
+    <w:p>
+      <w:pPr>
+        <w:numPr>
+          <w:ilvl w:val="0"/>
+          <w:numId w:val="1002"/>
+        </w:numPr>
+        <w:pStyle w:val="Compact"/>
+      </w:pPr>
+      <w:r>
+        <w:t xml:space="preserve">The Rev 1.4 mechanism is self-contradicting: it calls itself "no CDC" while the DMA</w:t>
+      </w:r>
+      <w:r>
+        <w:t xml:space="preserve"> </w:t>
+      </w:r>
+      <w:r>
+        <w:t xml:space="preserve">spec implements full CDC primitives against the same clock, and the ICG construction</w:t>
+      </w:r>
+      <w:r>
+        <w:t xml:space="preserve"> </w:t>
+      </w:r>
+      <w:r>
+        <w:t xml:space="preserve">it describes produces a 25% duty pulse train, not the 50% it claims.</w:t>
+      </w:r>
+    </w:p>
+    <w:p>
+      <w:pPr>
+        <w:numPr>
+          <w:ilvl w:val="0"/>
+          <w:numId w:val="1002"/>
+        </w:numPr>
+        <w:pStyle w:val="Compact"/>
+      </w:pPr>
+      <w:r>
+        <w:t xml:space="preserve">A generated clock is real PD work — a second</w:t>
+      </w:r>
+      <w:r>
+        <w:t xml:space="preserve"> </w:t>
+      </w:r>
+      <w:r>
+        <w:rPr>
+          <w:rStyle w:val="VerbatimChar"/>
+        </w:rPr>
+        <w:t xml:space="preserve">create_generated_clock</w:t>
+      </w:r>
+      <w:r>
+        <w:t xml:space="preserve">, gate-level</w:t>
+      </w:r>
+      <w:r>
+        <w:t xml:space="preserve"> </w:t>
+      </w:r>
+      <w:r>
+        <w:t xml:space="preserve">verification of the ICG, and CDC waivers that a reviewer has to trust.</w:t>
+      </w:r>
+    </w:p>
+    <w:p>
+      <w:pPr>
+        <w:numPr>
+          <w:ilvl w:val="0"/>
+          <w:numId w:val="1002"/>
+        </w:numPr>
+        <w:pStyle w:val="Compact"/>
+      </w:pPr>
+      <w:r>
+        <w:t xml:space="preserve">At 100 MHz there is no power or timing reason for the peripherals to run slower.</w:t>
+      </w:r>
+    </w:p>
+    <w:p>
+      <w:pPr>
+        <w:numPr>
+          <w:ilvl w:val="0"/>
+          <w:numId w:val="1002"/>
+        </w:numPr>
+        <w:pStyle w:val="Compact"/>
+      </w:pPr>
+      <w:r>
+        <w:t xml:space="preserve">Removing a clock domain removes an entire class of bug that is hard to find in</w:t>
+      </w:r>
+      <w:r>
+        <w:t xml:space="preserve"> </w:t>
+      </w:r>
+      <w:r>
+        <w:t xml:space="preserve">simulation and harder at bring-up.</w:t>
       </w:r>
     </w:p>
     <w:p>
@@ -650,177 +1045,6 @@
           <w:bCs/>
           <w:b/>
         </w:rPr>
-        <w:t xml:space="preserve">Supersedes:</w:t>
-      </w:r>
-      <w:r>
-        <w:t xml:space="preserve"> </w:t>
-      </w:r>
-      <w:r>
-        <w:t xml:space="preserve">AHB2APB Rev 1.4 §7 (pclk = hclk through an ICG at 125 MHz) and DMA</w:t>
-      </w:r>
-      <w:r>
-        <w:t xml:space="preserve"> </w:t>
-      </w:r>
-      <w:r>
-        <w:t xml:space="preserve">§15.3 (real CDC primitives on the config port).</w:t>
-      </w:r>
-    </w:p>
-    <w:p>
-      <w:pPr>
-        <w:pStyle w:val="BodyText"/>
-      </w:pPr>
-      <w:r>
-        <w:rPr>
-          <w:bCs/>
-          <w:b/>
-        </w:rPr>
-        <w:t xml:space="preserve">Decision.</w:t>
-      </w:r>
-      <w:r>
-        <w:t xml:space="preserve"> </w:t>
-      </w:r>
-      <w:r>
-        <w:t xml:space="preserve">One functional clock in the chip. The bridge holds APB timing with</w:t>
-      </w:r>
-      <w:r>
-        <w:t xml:space="preserve"> </w:t>
-      </w:r>
-      <w:r>
-        <w:t xml:space="preserve">PSEL/PENABLE phases on hclk. No clock gate, no generated clock, no</w:t>
-      </w:r>
-      <w:r>
-        <w:t xml:space="preserve"> </w:t>
-      </w:r>
-      <w:r>
-        <w:rPr>
-          <w:rStyle w:val="VerbatimChar"/>
-        </w:rPr>
-        <w:t xml:space="preserve">pclk_o</w:t>
-      </w:r>
-      <w:r>
-        <w:t xml:space="preserve"> </w:t>
-      </w:r>
-      <w:r>
-        <w:t xml:space="preserve">port, no</w:t>
-      </w:r>
-      <w:r>
-        <w:t xml:space="preserve"> </w:t>
-      </w:r>
-      <w:r>
-        <w:rPr>
-          <w:rStyle w:val="VerbatimChar"/>
-        </w:rPr>
-        <w:t xml:space="preserve">preset_n</w:t>
-      </w:r>
-      <w:r>
-        <w:t xml:space="preserve">. The DMA’s config port is an hclk APB slave and its gray-code counter,</w:t>
-      </w:r>
-      <w:r>
-        <w:t xml:space="preserve"> </w:t>
-      </w:r>
-      <w:r>
-        <w:t xml:space="preserve">toggle-handshake and level synchronisers are removed.</w:t>
-      </w:r>
-    </w:p>
-    <w:p>
-      <w:pPr>
-        <w:pStyle w:val="BodyText"/>
-      </w:pPr>
-      <w:r>
-        <w:rPr>
-          <w:bCs/>
-          <w:b/>
-        </w:rPr>
-        <w:t xml:space="preserve">Why.</w:t>
-      </w:r>
-      <w:r>
-        <w:t xml:space="preserve"> </w:t>
-      </w:r>
-      <w:r>
-        <w:t xml:space="preserve">1. The Rev 1.4 mechanism is self-contradicting: it calls itself</w:t>
-      </w:r>
-      <w:r>
-        <w:t xml:space="preserve"> </w:t>
-      </w:r>
-      <w:r>
-        <w:t xml:space="preserve">“</w:t>
-      </w:r>
-      <w:r>
-        <w:t xml:space="preserve">no CDC</w:t>
-      </w:r>
-      <w:r>
-        <w:t xml:space="preserve">”</w:t>
-      </w:r>
-      <w:r>
-        <w:t xml:space="preserve"> </w:t>
-      </w:r>
-      <w:r>
-        <w:t xml:space="preserve">while the DMA</w:t>
-      </w:r>
-      <w:r>
-        <w:t xml:space="preserve"> </w:t>
-      </w:r>
-      <w:r>
-        <w:t xml:space="preserve">spec implements full CDC primitives against the same clock, and the ICG construction</w:t>
-      </w:r>
-      <w:r>
-        <w:t xml:space="preserve"> </w:t>
-      </w:r>
-      <w:r>
-        <w:t xml:space="preserve">it describes produces a 25% duty pulse train, not the 50% it claims.</w:t>
-      </w:r>
-      <w:r>
-        <w:t xml:space="preserve"> </w:t>
-      </w:r>
-      <w:r>
-        <w:t xml:space="preserve">2. A generated clock is real PD work — a second</w:t>
-      </w:r>
-      <w:r>
-        <w:t xml:space="preserve"> </w:t>
-      </w:r>
-      <w:r>
-        <w:rPr>
-          <w:rStyle w:val="VerbatimChar"/>
-        </w:rPr>
-        <w:t xml:space="preserve">create_generated_clock</w:t>
-      </w:r>
-      <w:r>
-        <w:t xml:space="preserve">, gate-level</w:t>
-      </w:r>
-      <w:r>
-        <w:t xml:space="preserve"> </w:t>
-      </w:r>
-      <w:r>
-        <w:t xml:space="preserve">verification of the ICG, and CDC waivers that a reviewer has to trust.</w:t>
-      </w:r>
-      <w:r>
-        <w:t xml:space="preserve"> </w:t>
-      </w:r>
-      <w:r>
-        <w:t xml:space="preserve">3. At 100 MHz there is no power or timing reason for the peripherals to run slower.</w:t>
-      </w:r>
-      <w:r>
-        <w:t xml:space="preserve"> </w:t>
-      </w:r>
-      <w:r>
-        <w:t xml:space="preserve">4. Removing a clock domain removes an entire class of bug that is hard to find in</w:t>
-      </w:r>
-      <w:r>
-        <w:t xml:space="preserve"> </w:t>
-      </w:r>
-      <w:r>
-        <w:t xml:space="preserve">simulation and harder at bring-up.</w:t>
-      </w:r>
-    </w:p>
-    <w:p>
-      <w:pPr>
-        <w:pStyle w:val="BodyText"/>
-      </w:pPr>
-      <w:r>
-        <w:rPr>
-          <w:bCs/>
-          <w:b/>
-        </w:rPr>
         <w:t xml:space="preserve">Cost.</w:t>
       </w:r>
       <w:r>
@@ -833,7 +1057,7 @@
         <w:t xml:space="preserve"> </w:t>
       </w:r>
       <w:r>
-        <w:t xml:space="preserve">removing pclk, and it makes OPEN-1 blocking: every sourced IP’s maximum frequency must be</w:t>
+        <w:t xml:space="preserve">removing pclk, and it makes OPEN-1 blocking: every sourced IP's maximum frequency must be</w:t>
       </w:r>
       <w:r>
         <w:t xml:space="preserve"> </w:t>
@@ -966,8 +1190,8 @@
         </w:pict>
       </w:r>
     </w:p>
-    <w:bookmarkEnd w:id="21"/>
-    <w:bookmarkStart w:id="22" w:name="X00b150fcdf45d658600e607c6b5c1a65700af5f"/>
+    <w:bookmarkEnd w:id="22"/>
+    <w:bookmarkStart w:id="23" w:name="X44b4a628317313f1384579c967a1a90176eb4d8"/>
     <w:p>
       <w:pPr>
         <w:pStyle w:val="Heading2"/>
@@ -991,7 +1215,7 @@
         <w:t xml:space="preserve"> </w:t>
       </w:r>
       <w:r>
-        <w:t xml:space="preserve">CLKRST Rev 1.1 §7’s flat OR of all four reset sources into</w:t>
+        <w:t xml:space="preserve">CLKRST Rev 1.1 §7's flat OR of all four reset sources into</w:t>
       </w:r>
       <w:r>
         <w:t xml:space="preserve"> </w:t>
@@ -1049,7 +1273,7 @@
         <w:t xml:space="preserve"> </w:t>
       </w:r>
       <w:r>
-        <w:t xml:space="preserve">The watchdog’s</w:t>
+        <w:t xml:space="preserve">The watchdog's</w:t>
       </w:r>
       <w:r>
         <w:t xml:space="preserve"> </w:t>
@@ -1175,7 +1399,7 @@
         <w:t xml:space="preserve"> </w:t>
       </w:r>
       <w:r>
-        <w:t xml:space="preserve">debug-triggered reset would additionally reset the DM and so kill the debugger’s own</w:t>
+        <w:t xml:space="preserve">debug-triggered reset would additionally reset the DM and so kill the debugger's own</w:t>
       </w:r>
       <w:r>
         <w:t xml:space="preserve"> </w:t>
@@ -1239,8 +1463,8 @@
         </w:pict>
       </w:r>
     </w:p>
-    <w:bookmarkEnd w:id="22"/>
-    <w:bookmarkStart w:id="23" w:name="X111a52edb77479a217ebf21a88e94763f8b1579"/>
+    <w:bookmarkEnd w:id="23"/>
+    <w:bookmarkStart w:id="24" w:name="X5fac7bbf490867f51c97633d080b2e4a3bec4e8"/>
     <w:p>
       <w:pPr>
         <w:pStyle w:val="Heading2"/>
@@ -1264,7 +1488,7 @@
         <w:t xml:space="preserve"> </w:t>
       </w:r>
       <w:r>
-        <w:t xml:space="preserve">AHB Rev 3.0/3.1’s six-layer multi-layer matrix.</w:t>
+        <w:t xml:space="preserve">AHB Rev 3.0/3.1's six-layer multi-layer matrix.</w:t>
       </w:r>
     </w:p>
     <w:p>
@@ -1324,7 +1548,7 @@
         <w:t xml:space="preserve"> </w:t>
       </w:r>
       <w:r>
-        <w:t xml:space="preserve">(HPROT alone went from 4 to 28 wires by the spec’s own count) and a routing-congestion</w:t>
+        <w:t xml:space="preserve">(HPROT alone went from 4 to 28 wires by the spec's own count) and a routing-congestion</w:t>
       </w:r>
       <w:r>
         <w:t xml:space="preserve"> </w:t>
@@ -1366,7 +1590,7 @@
         <w:t xml:space="preserve"> </w:t>
       </w:r>
       <w:r>
-        <w:t xml:space="preserve">The CPU stalls for the DMA’s beat under contention, bounded at one beat.</w:t>
+        <w:t xml:space="preserve">The CPU stalls for the DMA's beat under contention, bounded at one beat.</w:t>
       </w:r>
     </w:p>
     <w:p>
@@ -1400,8 +1624,8 @@
         </w:pict>
       </w:r>
     </w:p>
-    <w:bookmarkEnd w:id="23"/>
-    <w:bookmarkStart w:id="24" w:name="Xeedba367a8d91e26dbd5636d3f92a2056171d4a"/>
+    <w:bookmarkEnd w:id="24"/>
+    <w:bookmarkStart w:id="25" w:name="Xdbafa4cee9827cd97d3f57dcff407d2265af710"/>
     <w:p>
       <w:pPr>
         <w:pStyle w:val="Heading2"/>
@@ -1425,25 +1649,13 @@
         <w:t xml:space="preserve"> </w:t>
       </w:r>
       <w:r>
-        <w:t xml:space="preserve">AHB Rev 3.1 §4 (</w:t>
-      </w:r>
-      <w:r>
-        <w:t xml:space="preserve">“</w:t>
-      </w:r>
-      <w:r>
-        <w:t xml:space="preserve">I-Port physically cannot reach DSRAM or the bridge, and</w:t>
-      </w:r>
-      <w:r>
-        <w:t xml:space="preserve"> </w:t>
-      </w:r>
-      <w:r>
-        <w:t xml:space="preserve">D-Port physically cannot reach ISRAM or Boot ROM — no wire exists in the netlist</w:t>
-      </w:r>
-      <w:r>
-        <w:t xml:space="preserve">”</w:t>
-      </w:r>
-      <w:r>
-        <w:t xml:space="preserve">).</w:t>
+        <w:t xml:space="preserve">AHB Rev 3.1 §4 ("I-Port physically cannot reach DSRAM or the bridge, and</w:t>
+      </w:r>
+      <w:r>
+        <w:t xml:space="preserve"> </w:t>
+      </w:r>
+      <w:r>
+        <w:t xml:space="preserve">D-Port physically cannot reach ISRAM or Boot ROM — no wire exists in the netlist").</w:t>
       </w:r>
     </w:p>
     <w:p>
@@ -1493,11 +1705,17 @@
       <w:r>
         <w:t xml:space="preserve">its own text elsewhere assumes work:</w:t>
       </w:r>
-      <w:r>
-        <w:t xml:space="preserve"> </w:t>
-      </w:r>
-      <w:r>
-        <w:t xml:space="preserve">1. The boot CRC. The bootloader runs on the core out of Boot ROM and must read back</w:t>
+    </w:p>
+    <w:p>
+      <w:pPr>
+        <w:numPr>
+          <w:ilvl w:val="0"/>
+          <w:numId w:val="1003"/>
+        </w:numPr>
+        <w:pStyle w:val="Compact"/>
+      </w:pPr>
+      <w:r>
+        <w:t xml:space="preserve">The boot CRC. The bootloader runs on the core out of Boot ROM and must read back</w:t>
       </w:r>
       <w:r>
         <w:t xml:space="preserve"> </w:t>
@@ -1505,15 +1723,15 @@
       <w:r>
         <w:t xml:space="preserve">ISRAM. No master could do that read.</w:t>
       </w:r>
-      <w:r>
-        <w:t xml:space="preserve"> </w:t>
-      </w:r>
-      <w:r>
-        <w:t xml:space="preserve">2.</w:t>
-      </w:r>
-      <w:r>
-        <w:t xml:space="preserve"> </w:t>
-      </w:r>
+    </w:p>
+    <w:p>
+      <w:pPr>
+        <w:numPr>
+          <w:ilvl w:val="0"/>
+          <w:numId w:val="1003"/>
+        </w:numPr>
+        <w:pStyle w:val="Compact"/>
+      </w:pPr>
       <w:r>
         <w:rPr>
           <w:rStyle w:val="VerbatimChar"/>
@@ -1547,16 +1765,22 @@
       <w:r>
         <w:t xml:space="preserve">D-port could not reach.</w:t>
       </w:r>
-      <w:r>
-        <w:t xml:space="preserve"> </w:t>
-      </w:r>
-      <w:r>
-        <w:t xml:space="preserve">3. JTAG firmware load, since progbuf and SBA writes both land on a data master.</w:t>
-      </w:r>
-    </w:p>
-    <w:p>
-      <w:pPr>
-        <w:pStyle w:val="BodyText"/>
+    </w:p>
+    <w:p>
+      <w:pPr>
+        <w:numPr>
+          <w:ilvl w:val="0"/>
+          <w:numId w:val="1003"/>
+        </w:numPr>
+        <w:pStyle w:val="Compact"/>
+      </w:pPr>
+      <w:r>
+        <w:t xml:space="preserve">JTAG firmware load, since progbuf and SBA writes both land on a data master.</w:t>
+      </w:r>
+    </w:p>
+    <w:p>
+      <w:pPr>
+        <w:pStyle w:val="FirstParagraph"/>
       </w:pPr>
       <w:r>
         <w:t xml:space="preserve">The restriction also saved nothing: the decoder is a 4-bit case statement either way.</w:t>
@@ -1605,8 +1829,8 @@
         </w:pict>
       </w:r>
     </w:p>
-    <w:bookmarkEnd w:id="24"/>
-    <w:bookmarkStart w:id="25" w:name="X0226926ebab94703718d4e6e4ef772217a8ff20"/>
+    <w:bookmarkEnd w:id="25"/>
+    <w:bookmarkStart w:id="26" w:name="Xb3883639c0c476428fc19fee31c0364b5586f97"/>
     <w:p>
       <w:pPr>
         <w:pStyle w:val="Heading2"/>
@@ -1712,8 +1936,8 @@
         </w:pict>
       </w:r>
     </w:p>
-    <w:bookmarkEnd w:id="25"/>
-    <w:bookmarkStart w:id="26" w:name="X7e02580e372ccad24872aea126e20303a85c324"/>
+    <w:bookmarkEnd w:id="26"/>
+    <w:bookmarkStart w:id="27" w:name="Xc21f0ff3abb0647bef61ebd99e01a5504ad9a71"/>
     <w:p>
       <w:pPr>
         <w:pStyle w:val="Heading2"/>
@@ -1737,7 +1961,7 @@
         <w:t xml:space="preserve"> </w:t>
       </w:r>
       <w:r>
-        <w:t xml:space="preserve">MEM Rev 1.2’s four independent AHB slave endpoints.</w:t>
+        <w:t xml:space="preserve">MEM Rev 1.2's four independent AHB slave endpoints.</w:t>
       </w:r>
     </w:p>
     <w:p>
@@ -1879,8 +2103,8 @@
         </w:pict>
       </w:r>
     </w:p>
-    <w:bookmarkEnd w:id="26"/>
-    <w:bookmarkStart w:id="27" w:name="X41ee682b5f0b26c12c8482dae175457fc3a9214"/>
+    <w:bookmarkEnd w:id="27"/>
+    <w:bookmarkStart w:id="28" w:name="X9dd6f2b5e6fd2b1424e662ef589f8d2cabf5852"/>
     <w:p>
       <w:pPr>
         <w:pStyle w:val="Heading2"/>
@@ -1983,17 +2207,29 @@
       <w:r>
         <w:t xml:space="preserve">Key changes it embodies:</w:t>
       </w:r>
-      <w:r>
-        <w:t xml:space="preserve"> </w:t>
-      </w:r>
-      <w:r>
-        <w:t xml:space="preserve">- Sonar moves to I²C. A UART sonar was consuming a whole serial port for one range value.</w:t>
-      </w:r>
-      <w:r>
-        <w:t xml:space="preserve"> </w:t>
-      </w:r>
-      <w:r>
-        <w:t xml:space="preserve">- Telemetry and LoRa are one role, the ground link, on UART1. Pick one radio at board</w:t>
+    </w:p>
+    <w:p>
+      <w:pPr>
+        <w:numPr>
+          <w:ilvl w:val="0"/>
+          <w:numId w:val="1004"/>
+        </w:numPr>
+        <w:pStyle w:val="Compact"/>
+      </w:pPr>
+      <w:r>
+        <w:t xml:space="preserve">Sonar moves to I²C. A UART sonar was consuming a whole serial port for one range value.</w:t>
+      </w:r>
+    </w:p>
+    <w:p>
+      <w:pPr>
+        <w:numPr>
+          <w:ilvl w:val="0"/>
+          <w:numId w:val="1004"/>
+        </w:numPr>
+        <w:pStyle w:val="Compact"/>
+      </w:pPr>
+      <w:r>
+        <w:t xml:space="preserve">Telemetry and LoRa are one role, the ground link, on UART1. Pick one radio at board</w:t>
       </w:r>
       <w:r>
         <w:t xml:space="preserve"> </w:t>
@@ -2001,29 +2237,17 @@
       <w:r>
         <w:t xml:space="preserve">level; the chip does not need both.</w:t>
       </w:r>
-      <w:r>
-        <w:t xml:space="preserve"> </w:t>
-      </w:r>
-      <w:r>
-        <w:t xml:space="preserve">- ESP-NOW is the ESP32 companion on the SPI slave port, CH4.</w:t>
-      </w:r>
-      <w:r>
-        <w:t xml:space="preserve"> </w:t>
-      </w:r>
-      <w:r>
-        <w:t xml:space="preserve">“</w:t>
-      </w:r>
-      <w:r>
-        <w:t xml:space="preserve">GPIO/SPI2</w:t>
-      </w:r>
-      <w:r>
-        <w:t xml:space="preserve">”</w:t>
-      </w:r>
-      <w:r>
-        <w:t xml:space="preserve"> </w:t>
-      </w:r>
-      <w:r>
-        <w:t xml:space="preserve">named a block</w:t>
+    </w:p>
+    <w:p>
+      <w:pPr>
+        <w:numPr>
+          <w:ilvl w:val="0"/>
+          <w:numId w:val="1004"/>
+        </w:numPr>
+        <w:pStyle w:val="Compact"/>
+      </w:pPr>
+      <w:r>
+        <w:t xml:space="preserve">ESP-NOW is the ESP32 companion on the SPI slave port, CH4. "GPIO/SPI2" named a block</w:t>
       </w:r>
       <w:r>
         <w:t xml:space="preserve"> </w:t>
@@ -2031,11 +2255,17 @@
       <w:r>
         <w:t xml:space="preserve">that does not exist and made a GPIO controller a DMA source, which it cannot be.</w:t>
       </w:r>
-      <w:r>
-        <w:t xml:space="preserve"> </w:t>
-      </w:r>
-      <w:r>
-        <w:t xml:space="preserve">- UART2 (console) gets CH5. No channel is shared by two peripherals, which was never</w:t>
+    </w:p>
+    <w:p>
+      <w:pPr>
+        <w:numPr>
+          <w:ilvl w:val="0"/>
+          <w:numId w:val="1004"/>
+        </w:numPr>
+        <w:pStyle w:val="Compact"/>
+      </w:pPr>
+      <w:r>
+        <w:t xml:space="preserve">UART2 (console) gets CH5. No channel is shared by two peripherals, which was never</w:t>
       </w:r>
       <w:r>
         <w:t xml:space="preserve"> </w:t>
@@ -2070,7 +2300,7 @@
     </w:p>
     <w:p>
       <w:pPr>
-        <w:pStyle w:val="BodyText"/>
+        <w:pStyle w:val="FirstParagraph"/>
       </w:pPr>
       <w:r>
         <w:rPr>
@@ -2093,8 +2323,8 @@
         </w:pict>
       </w:r>
     </w:p>
-    <w:bookmarkEnd w:id="27"/>
-    <w:bookmarkStart w:id="28" w:name="Xd31fa3eaf3d8ebcfa1de79b57c666e9c23c1c07"/>
+    <w:bookmarkEnd w:id="28"/>
+    <w:bookmarkStart w:id="29" w:name="X68b7aab1f96fa92e4cacb854b97a4b821b4ec60"/>
     <w:p>
       <w:pPr>
         <w:pStyle w:val="Heading2"/>
@@ -2175,7 +2405,7 @@
         <w:t xml:space="preserve"> </w:t>
       </w:r>
       <w:r>
-        <w:t xml:space="preserve">Trigger type is a property of each source’s hardware, not a firmware preference,</w:t>
+        <w:t xml:space="preserve">Trigger type is a property of each source's hardware, not a firmware preference,</w:t>
       </w:r>
       <w:r>
         <w:t xml:space="preserve"> </w:t>
@@ -2215,8 +2445,8 @@
         </w:pict>
       </w:r>
     </w:p>
-    <w:bookmarkEnd w:id="28"/>
-    <w:bookmarkStart w:id="29" w:name="Xeb0e26403e268887884c1fd4da395b67519544a"/>
+    <w:bookmarkEnd w:id="29"/>
+    <w:bookmarkStart w:id="30" w:name="Xf8e5b5418228892f72e8d5393a2feea72e086be"/>
     <w:p>
       <w:pPr>
         <w:pStyle w:val="Heading2"/>
@@ -2270,7 +2500,7 @@
         <w:t xml:space="preserve"> </w:t>
       </w:r>
       <w:r>
-        <w:t xml:space="preserve">as CLIC ID 13, and the core’s</w:t>
+        <w:t xml:space="preserve">as CLIC ID 13, and the core's</w:t>
       </w:r>
       <w:r>
         <w:t xml:space="preserve"> </w:t>
@@ -2354,7 +2584,7 @@
         <w:t xml:space="preserve"> </w:t>
       </w:r>
       <w:r>
-        <w:t xml:space="preserve">wire into the core’s existing</w:t>
+        <w:t xml:space="preserve">wire into the core's existing</w:t>
       </w:r>
       <w:r>
         <w:t xml:space="preserve"> </w:t>
@@ -2420,7 +2650,7 @@
         <w:t xml:space="preserve"> </w:t>
       </w:r>
       <w:r>
-        <w:t xml:space="preserve">top-level wires and a 64-bit comparator from the core’s timing cone.</w:t>
+        <w:t xml:space="preserve">top-level wires and a 64-bit comparator from the core's timing cone.</w:t>
       </w:r>
     </w:p>
     <w:p>
@@ -2520,8 +2750,8 @@
         </w:pict>
       </w:r>
     </w:p>
-    <w:bookmarkEnd w:id="29"/>
-    <w:bookmarkStart w:id="30" w:name="adr-0011-there-are-22-blocks-not-24."/>
+    <w:bookmarkEnd w:id="30"/>
+    <w:bookmarkStart w:id="31" w:name="adr-0011--there-are-22-blocks-not-24"/>
     <w:p>
       <w:pPr>
         <w:pStyle w:val="Heading2"/>
@@ -2587,22 +2817,7 @@
         <w:t xml:space="preserve"> </w:t>
       </w:r>
       <w:r>
-        <w:t xml:space="preserve">is 22. Blocks 23 and 24 do not exist, and no block is</w:t>
-      </w:r>
-      <w:r>
-        <w:t xml:space="preserve"> </w:t>
-      </w:r>
-      <w:r>
-        <w:t xml:space="preserve">“</w:t>
-      </w:r>
-      <w:r>
-        <w:t xml:space="preserve">Reserved</w:t>
-      </w:r>
-      <w:r>
-        <w:t xml:space="preserve">”</w:t>
-      </w:r>
-      <w:r>
-        <w:t xml:space="preserve">.</w:t>
+        <w:t xml:space="preserve">is 22. Blocks 23 and 24 do not exist, and no block is "Reserved".</w:t>
       </w:r>
     </w:p>
     <w:p>
@@ -2620,7 +2835,7 @@
         <w:t xml:space="preserve"> </w:t>
       </w:r>
       <w:r>
-        <w:t xml:space="preserve">The TRM’s 24-block table carried two reserved rows nothing claimed and marked</w:t>
+        <w:t xml:space="preserve">The TRM's 24-block table carried two reserved rows nothing claimed and marked</w:t>
       </w:r>
       <w:r>
         <w:t xml:space="preserve"> </w:t>
@@ -2666,8 +2881,8 @@
         </w:pict>
       </w:r>
     </w:p>
-    <w:bookmarkEnd w:id="30"/>
-    <w:bookmarkStart w:id="31" w:name="Xf0be1286af718890051078560f48b07428293df"/>
+    <w:bookmarkEnd w:id="31"/>
+    <w:bookmarkStart w:id="32" w:name="Xf462eca63dd0413ec11ca933e58350014edb71b"/>
     <w:p>
       <w:pPr>
         <w:pStyle w:val="Heading2"/>
@@ -2691,25 +2906,13 @@
         <w:t xml:space="preserve"> </w:t>
       </w:r>
       <w:r>
-        <w:t xml:space="preserve">DEBUG Rev 1.0’s Access Register + Program Buffer design and its</w:t>
-      </w:r>
-      <w:r>
-        <w:t xml:space="preserve"> </w:t>
-      </w:r>
-      <w:r>
-        <w:t xml:space="preserve">“</w:t>
-      </w:r>
-      <w:r>
-        <w:t xml:space="preserve">deliberately no bus presence</w:t>
-      </w:r>
-      <w:r>
-        <w:t xml:space="preserve">”</w:t>
-      </w:r>
-      <w:r>
-        <w:t xml:space="preserve"> </w:t>
-      </w:r>
-      <w:r>
-        <w:t xml:space="preserve">decision.</w:t>
+        <w:t xml:space="preserve">DEBUG Rev 1.0's Access Register + Program Buffer design and its</w:t>
+      </w:r>
+      <w:r>
+        <w:t xml:space="preserve"> </w:t>
+      </w:r>
+      <w:r>
+        <w:t xml:space="preserve">"deliberately no bus presence" decision.</w:t>
       </w:r>
     </w:p>
     <w:p>
@@ -2777,11 +2980,17 @@
         </w:rPr>
         <w:t xml:space="preserve">Why.</w:t>
       </w:r>
-      <w:r>
-        <w:t xml:space="preserve"> </w:t>
-      </w:r>
-      <w:r>
-        <w:t xml:space="preserve">1. The Rev 1.0 design rests on core features that do not exist.</w:t>
+    </w:p>
+    <w:p>
+      <w:pPr>
+        <w:numPr>
+          <w:ilvl w:val="0"/>
+          <w:numId w:val="1005"/>
+        </w:numPr>
+        <w:pStyle w:val="Compact"/>
+      </w:pPr>
+      <w:r>
+        <w:t xml:space="preserve">The Rev 1.0 design rests on core features that do not exist.</w:t>
       </w:r>
       <w:r>
         <w:t xml:space="preserve"> </w:t>
@@ -2844,31 +3053,13 @@
         <w:t xml:space="preserve"> </w:t>
       </w:r>
       <w:r>
-        <w:t xml:space="preserve">redirect. DEBUG §1 asserts the core</w:t>
-      </w:r>
-      <w:r>
-        <w:t xml:space="preserve"> </w:t>
-      </w:r>
-      <w:r>
-        <w:t xml:space="preserve">“</w:t>
-      </w:r>
-      <w:r>
-        <w:t xml:space="preserve">already commits</w:t>
-      </w:r>
-      <w:r>
-        <w:t xml:space="preserve">”</w:t>
-      </w:r>
-      <w:r>
-        <w:t xml:space="preserve"> </w:t>
-      </w:r>
-      <w:r>
-        <w:t xml:space="preserve">to all of them. Building them</w:t>
-      </w:r>
-      <w:r>
-        <w:t xml:space="preserve"> </w:t>
-      </w:r>
-      <w:r>
-        <w:t xml:space="preserve">means a new pipeline-control mode in the block that produced most of this project’s</w:t>
+        <w:t xml:space="preserve">redirect. DEBUG §1 asserts the core "already commits" to all of them. Building them</w:t>
+      </w:r>
+      <w:r>
+        <w:t xml:space="preserve"> </w:t>
+      </w:r>
+      <w:r>
+        <w:t xml:space="preserve">means a new pipeline-control mode in the block that produced most of this project's</w:t>
       </w:r>
       <w:r>
         <w:t xml:space="preserve"> </w:t>
@@ -2876,11 +3067,17 @@
       <w:r>
         <w:t xml:space="preserve">27 errata, then re-verifying it, in six weeks.</w:t>
       </w:r>
-      <w:r>
-        <w:t xml:space="preserve"> </w:t>
-      </w:r>
-      <w:r>
-        <w:t xml:space="preserve">2. SBA needs zero core changes and delivers the thing that actually matters day to day:</w:t>
+    </w:p>
+    <w:p>
+      <w:pPr>
+        <w:numPr>
+          <w:ilvl w:val="0"/>
+          <w:numId w:val="1005"/>
+        </w:numPr>
+        <w:pStyle w:val="Compact"/>
+      </w:pPr>
+      <w:r>
+        <w:t xml:space="preserve">SBA needs zero core changes and delivers the thing that actually matters day to day:</w:t>
       </w:r>
       <w:r>
         <w:t xml:space="preserve"> </w:t>
@@ -2888,29 +3085,17 @@
       <w:r>
         <w:t xml:space="preserve">loading firmware into ISRAM over JTAG instead of reflashing SPI every iteration.</w:t>
       </w:r>
-      <w:r>
-        <w:t xml:space="preserve"> </w:t>
-      </w:r>
-      <w:r>
-        <w:t xml:space="preserve">3. The</w:t>
-      </w:r>
-      <w:r>
-        <w:t xml:space="preserve"> </w:t>
-      </w:r>
-      <w:r>
-        <w:t xml:space="preserve">“</w:t>
-      </w:r>
-      <w:r>
-        <w:t xml:space="preserve">stay off the bus so debug works when the bus is broken</w:t>
-      </w:r>
-      <w:r>
-        <w:t xml:space="preserve">”</w:t>
-      </w:r>
-      <w:r>
-        <w:t xml:space="preserve"> </w:t>
-      </w:r>
-      <w:r>
-        <w:t xml:space="preserve">rationale did not hold —</w:t>
+    </w:p>
+    <w:p>
+      <w:pPr>
+        <w:numPr>
+          <w:ilvl w:val="0"/>
+          <w:numId w:val="1005"/>
+        </w:numPr>
+        <w:pStyle w:val="Compact"/>
+      </w:pPr>
+      <w:r>
+        <w:t xml:space="preserve">The "stay off the bus so debug works when the bus is broken" rationale did not hold —</w:t>
       </w:r>
       <w:r>
         <w:t xml:space="preserve"> </w:t>
@@ -2927,7 +3112,7 @@
     </w:p>
     <w:p>
       <w:pPr>
-        <w:pStyle w:val="BodyText"/>
+        <w:pStyle w:val="FirstParagraph"/>
       </w:pPr>
       <w:r>
         <w:rPr>
@@ -2998,8 +3183,82 @@
         </w:pict>
       </w:r>
     </w:p>
-    <w:bookmarkEnd w:id="31"/>
-    <w:bookmarkStart w:id="32" w:name="X4f50b4aeac511a18fc38fb35e038eeabeb451c4"/>
+    <w:p>
+      <w:pPr>
+        <w:pStyle w:val="BlockText"/>
+      </w:pPr>
+      <w:r>
+        <w:rPr>
+          <w:bCs/>
+          <w:b/>
+        </w:rPr>
+        <w:t xml:space="preserve">[Superseded - pin counts]</w:t>
+      </w:r>
+      <w:r>
+        <w:t xml:space="preserve"> </w:t>
+      </w:r>
+      <w:r>
+        <w:t xml:space="preserve">The "36 of 40, 4 spare" figure is superseded by ADR-0020</w:t>
+      </w:r>
+      <w:r>
+        <w:t xml:space="preserve"> </w:t>
+      </w:r>
+      <w:r>
+        <w:t xml:space="preserve">(28-pin baseline: 26 used, 2 spare) and amended again by</w:t>
+      </w:r>
+      <w:r>
+        <w:t xml:space="preserve"> </w:t>
+      </w:r>
+      <w:r>
+        <w:rPr>
+          <w:bCs/>
+          <w:b/>
+        </w:rPr>
+        <w:t xml:space="preserve">ADR-0020 Rev 2</w:t>
+      </w:r>
+      <w:r>
+        <w:t xml:space="preserve"> </w:t>
+      </w:r>
+      <w:r>
+        <w:t xml:space="preserve">(ESP-NOW</w:t>
+      </w:r>
+      <w:r>
+        <w:t xml:space="preserve"> </w:t>
+      </w:r>
+      <w:r>
+        <w:t xml:space="preserve">restored). The</w:t>
+      </w:r>
+      <w:r>
+        <w:t xml:space="preserve"> </w:t>
+      </w:r>
+      <w:r>
+        <w:rPr>
+          <w:iCs/>
+          <w:i/>
+        </w:rPr>
+        <w:t xml:space="preserve">allocation principles</w:t>
+      </w:r>
+      <w:r>
+        <w:t xml:space="preserve"> </w:t>
+      </w:r>
+      <w:r>
+        <w:t xml:space="preserve">below (dedicated PWM, two SPI chip-selects,</w:t>
+      </w:r>
+      <w:r>
+        <w:t xml:space="preserve"> </w:t>
+      </w:r>
+      <w:r>
+        <w:rPr>
+          <w:rStyle w:val="VerbatimChar"/>
+        </w:rPr>
+        <w:t xml:space="preserve">boot_sel</w:t>
+      </w:r>
+      <w:r>
+        <w:t xml:space="preserve">) stand; only the counts moved. ADR-by-number rule: highest-numbered ADR wins.</w:t>
+      </w:r>
+    </w:p>
+    <w:bookmarkEnd w:id="32"/>
+    <w:bookmarkStart w:id="33" w:name="X3fabe39c988a729c38d592204a4e9d69c7466aa"/>
     <w:p>
       <w:pPr>
         <w:pStyle w:val="Heading2"/>
@@ -3023,37 +3282,55 @@
         <w:t xml:space="preserve"> </w:t>
       </w:r>
       <w:r>
-        <w:t xml:space="preserve">TRM §4.2’s</w:t>
-      </w:r>
-      <w:r>
-        <w:t xml:space="preserve"> </w:t>
-      </w:r>
-      <w:r>
-        <w:t xml:space="preserve">“</w:t>
-      </w:r>
-      <w:r>
-        <w:t xml:space="preserve">GPIO = remaining budget</w:t>
-      </w:r>
-      <w:r>
-        <w:t xml:space="preserve">”</w:t>
-      </w:r>
-      <w:r>
-        <w:t xml:space="preserve"> </w:t>
-      </w:r>
-      <w:r>
-        <w:t xml:space="preserve">and</w:t>
-      </w:r>
-      <w:r>
-        <w:t xml:space="preserve"> </w:t>
-      </w:r>
-      <w:r>
-        <w:t xml:space="preserve">“</w:t>
-      </w:r>
-      <w:r>
-        <w:t xml:space="preserve">PWM shares GPIO pins</w:t>
-      </w:r>
-      <w:r>
-        <w:t xml:space="preserve">”</w:t>
+        <w:t xml:space="preserve">TRM §4.2's "GPIO = remaining budget" and "PWM shares GPIO pins".</w:t>
+      </w:r>
+    </w:p>
+    <w:p>
+      <w:pPr>
+        <w:pStyle w:val="BodyText"/>
+      </w:pPr>
+      <w:r>
+        <w:rPr>
+          <w:bCs/>
+          <w:b/>
+        </w:rPr>
+        <w:t xml:space="preserve">Decision.</w:t>
+      </w:r>
+      <w:r>
+        <w:t xml:space="preserve"> </w:t>
+      </w:r>
+      <w:r>
+        <w:t xml:space="preserve">The</w:t>
+      </w:r>
+      <w:r>
+        <w:t xml:space="preserve"> </w:t>
+      </w:r>
+      <w:r>
+        <w:rPr>
+          <w:rStyle w:val="VerbatimChar"/>
+        </w:rPr>
+        <w:t xml:space="preserve">pins.allocation</w:t>
+      </w:r>
+      <w:r>
+        <w:t xml:space="preserve"> </w:t>
+      </w:r>
+      <w:r>
+        <w:t xml:space="preserve">table. GPIO is exactly 8 pins, PWM is 4 dedicated</w:t>
+      </w:r>
+      <w:r>
+        <w:t xml:space="preserve"> </w:t>
+      </w:r>
+      <w:r>
+        <w:t xml:space="preserve">pins, SPI master gets 2 chip selects, and one pin is</w:t>
+      </w:r>
+      <w:r>
+        <w:t xml:space="preserve"> </w:t>
+      </w:r>
+      <w:r>
+        <w:rPr>
+          <w:rStyle w:val="VerbatimChar"/>
+        </w:rPr>
+        <w:t xml:space="preserve">boot_sel</w:t>
       </w:r>
       <w:r>
         <w:t xml:space="preserve">.</w:t>
@@ -3068,76 +3345,13 @@
           <w:bCs/>
           <w:b/>
         </w:rPr>
-        <w:t xml:space="preserve">Decision.</w:t>
-      </w:r>
-      <w:r>
-        <w:t xml:space="preserve"> </w:t>
-      </w:r>
-      <w:r>
-        <w:t xml:space="preserve">The</w:t>
-      </w:r>
-      <w:r>
-        <w:t xml:space="preserve"> </w:t>
-      </w:r>
-      <w:r>
-        <w:rPr>
-          <w:rStyle w:val="VerbatimChar"/>
-        </w:rPr>
-        <w:t xml:space="preserve">pins.allocation</w:t>
-      </w:r>
-      <w:r>
-        <w:t xml:space="preserve"> </w:t>
-      </w:r>
-      <w:r>
-        <w:t xml:space="preserve">table. GPIO is exactly 8 pins, PWM is 4 dedicated</w:t>
-      </w:r>
-      <w:r>
-        <w:t xml:space="preserve"> </w:t>
-      </w:r>
-      <w:r>
-        <w:t xml:space="preserve">pins, SPI master gets 2 chip selects, and one pin is</w:t>
-      </w:r>
-      <w:r>
-        <w:t xml:space="preserve"> </w:t>
-      </w:r>
-      <w:r>
-        <w:rPr>
-          <w:rStyle w:val="VerbatimChar"/>
-        </w:rPr>
-        <w:t xml:space="preserve">boot_sel</w:t>
-      </w:r>
-      <w:r>
-        <w:t xml:space="preserve">.</w:t>
-      </w:r>
-    </w:p>
-    <w:p>
-      <w:pPr>
-        <w:pStyle w:val="BodyText"/>
-      </w:pPr>
-      <w:r>
-        <w:rPr>
-          <w:bCs/>
-          <w:b/>
-        </w:rPr>
         <w:t xml:space="preserve">Why.</w:t>
       </w:r>
       <w:r>
         <w:t xml:space="preserve"> </w:t>
       </w:r>
       <w:r>
-        <w:t xml:space="preserve">“</w:t>
-      </w:r>
-      <w:r>
-        <w:t xml:space="preserve">Remaining budget</w:t>
-      </w:r>
-      <w:r>
-        <w:t xml:space="preserve">”</w:t>
-      </w:r>
-      <w:r>
-        <w:t xml:space="preserve"> </w:t>
-      </w:r>
-      <w:r>
-        <w:t xml:space="preserve">is not a specification — it meant no document owned the</w:t>
+        <w:t xml:space="preserve">"Remaining budget" is not a specification — it meant no document owned the</w:t>
       </w:r>
       <w:r>
         <w:t xml:space="preserve"> </w:t>
@@ -3225,8 +3439,8 @@
         </w:pict>
       </w:r>
     </w:p>
-    <w:bookmarkEnd w:id="32"/>
-    <w:bookmarkStart w:id="33" w:name="Xb4361cc17d5a7134d6fc3f7ce41e0ed4e384f32"/>
+    <w:bookmarkEnd w:id="33"/>
+    <w:bookmarkStart w:id="34" w:name="X54d57331596094f008777280de63464cc01900b"/>
     <w:p>
       <w:pPr>
         <w:pStyle w:val="Heading2"/>
@@ -3335,8 +3549,8 @@
         </w:pict>
       </w:r>
     </w:p>
-    <w:bookmarkEnd w:id="33"/>
-    <w:bookmarkStart w:id="34" w:name="Xe183d3137d7c949d4da5c304aadeb6f9d0e5c6e"/>
+    <w:bookmarkEnd w:id="34"/>
+    <w:bookmarkStart w:id="35" w:name="X79a6c9f7f294dbdb0c0940a586761625cd116d8"/>
     <w:p>
       <w:pPr>
         <w:pStyle w:val="Heading2"/>
@@ -3360,7 +3574,7 @@
         <w:t xml:space="preserve"> </w:t>
       </w:r>
       <w:r>
-        <w:t xml:space="preserve">MEM §8.5’s DMA P2M flash→ISRAM copy and AHB §13.6’s dedicated DMA→ISRAM</w:t>
+        <w:t xml:space="preserve">MEM §8.5's DMA P2M flash→ISRAM copy and AHB §13.6's dedicated DMA→ISRAM</w:t>
       </w:r>
       <w:r>
         <w:t xml:space="preserve"> </w:t>
@@ -3402,7 +3616,7 @@
         <w:t xml:space="preserve"> </w:t>
       </w:r>
       <w:r>
-        <w:t xml:space="preserve">The DMA copy depended on the sourced SPI master’s data register having</w:t>
+        <w:t xml:space="preserve">The DMA copy depended on the sourced SPI master's data register having</w:t>
       </w:r>
       <w:r>
         <w:t xml:space="preserve"> </w:t>
@@ -3481,8 +3695,8 @@
         </w:pict>
       </w:r>
     </w:p>
-    <w:bookmarkEnd w:id="34"/>
-    <w:bookmarkStart w:id="35" w:name="Xf4efd3f6a7645b87119f96886989c19569a6ae1"/>
+    <w:bookmarkEnd w:id="35"/>
+    <w:bookmarkStart w:id="36" w:name="X9d5cef842b69db4f45adca0c34feaad04f2ef37"/>
     <w:p>
       <w:pPr>
         <w:pStyle w:val="Heading2"/>
@@ -3506,7 +3720,7 @@
         <w:t xml:space="preserve"> </w:t>
       </w:r>
       <w:r>
-        <w:t xml:space="preserve">MEM Rev 1.1’s CRC-16-CCITT and dead halt on mismatch.</w:t>
+        <w:t xml:space="preserve">MEM Rev 1.1's CRC-16-CCITT and dead halt on mismatch.</w:t>
       </w:r>
     </w:p>
     <w:p>
@@ -3615,14 +3829,14 @@
         </w:pict>
       </w:r>
     </w:p>
-    <w:bookmarkEnd w:id="35"/>
-    <w:bookmarkStart w:id="36" w:name="X9278d18c24cda8cee371adf370f349800c6e337"/>
+    <w:bookmarkEnd w:id="36"/>
+    <w:bookmarkStart w:id="37" w:name="X88aeb847a5cc25e2973ccd0f2f4c42064f62b3a"/>
     <w:p>
       <w:pPr>
         <w:pStyle w:val="Heading2"/>
       </w:pPr>
       <w:r>
-        <w:t xml:space="preserve">ADR-0017 — The DSU’s numeric contract is Q1.15 in, Q18.30 in the accumulator.</w:t>
+        <w:t xml:space="preserve">ADR-0017 — The DSU's numeric contract is Q1.15 in, Q18.30 in the accumulator.</w:t>
       </w:r>
     </w:p>
     <w:p>
@@ -3682,7 +3896,7 @@
         <w:t xml:space="preserve"> </w:t>
       </w:r>
       <w:r>
-        <w:t xml:space="preserve">A 9-state EKF’s covariance terms span a dynamic range Q1.15 cannot hold, so the spec has</w:t>
+        <w:t xml:space="preserve">A 9-state EKF's covariance terms span a dynamic range Q1.15 cannot hold, so the spec has</w:t>
       </w:r>
       <w:r>
         <w:t xml:space="preserve"> </w:t>
@@ -3729,8 +3943,8 @@
         </w:pict>
       </w:r>
     </w:p>
-    <w:bookmarkEnd w:id="36"/>
-    <w:bookmarkStart w:id="37" w:name="X6a2a76e5d34dfb5c943217e54083aa7d523b5ca"/>
+    <w:bookmarkEnd w:id="37"/>
+    <w:bookmarkStart w:id="38" w:name="Xbecdc2c268ca366f8a8751146efc7aab6bca5cc"/>
     <w:p>
       <w:pPr>
         <w:pStyle w:val="Heading2"/>
@@ -3784,7 +3998,7 @@
         <w:t xml:space="preserve"> </w:t>
       </w:r>
       <w:r>
-        <w:t xml:space="preserve">connects the pad’s input buffer to that flop’s clock input and nothing else. The flop is</w:t>
+        <w:t xml:space="preserve">connects the pad's input buffer to that flop's clock input and nothing else. The flop is</w:t>
       </w:r>
       <w:r>
         <w:t xml:space="preserve"> </w:t>
@@ -3829,7 +4043,7 @@
         <w:t xml:space="preserve"> </w:t>
       </w:r>
       <w:r>
-        <w:t xml:space="preserve">insertion-delay budget, couples into neighbours, and makes the reference’s duty distortion</w:t>
+        <w:t xml:space="preserve">insertion-delay budget, couples into neighbours, and makes the reference's duty distortion</w:t>
       </w:r>
       <w:r>
         <w:t xml:space="preserve"> </w:t>
@@ -3841,7 +4055,7 @@
         <w:t xml:space="preserve"> </w:t>
       </w:r>
       <w:r>
-        <w:t xml:space="preserve">local one, and every other net in the chip becomes 250 MHz or slower. The flop’s own path</w:t>
+        <w:t xml:space="preserve">local one, and every other net in the chip becomes 250 MHz or slower. The flop's own path</w:t>
       </w:r>
       <w:r>
         <w:t xml:space="preserve"> </w:t>
@@ -3911,8 +4125,8 @@
         </w:pict>
       </w:r>
     </w:p>
-    <w:bookmarkEnd w:id="37"/>
-    <w:bookmarkStart w:id="38" w:name="Xc4ef5d4797a0c262617b87b324d8c2ea3abcfc7"/>
+    <w:bookmarkEnd w:id="38"/>
+    <w:bookmarkStart w:id="39" w:name="X114951eedcb02da9d14221d10b86e7d4b1e31fc"/>
     <w:p>
       <w:pPr>
         <w:pStyle w:val="Heading2"/>
@@ -3948,7 +4162,7 @@
         <w:t xml:space="preserve"> </w:t>
       </w:r>
       <w:r>
-        <w:t xml:space="preserve">CLKRST Rev 1.1’s assumption that an analog power-on-reset cell exists and</w:t>
+        <w:t xml:space="preserve">CLKRST Rev 1.1's assumption that an analog power-on-reset cell exists and</w:t>
       </w:r>
       <w:r>
         <w:t xml:space="preserve"> </w:t>
@@ -4120,8 +4334,8 @@
         </w:pict>
       </w:r>
     </w:p>
-    <w:bookmarkEnd w:id="38"/>
-    <w:bookmarkStart w:id="39" w:name="Xa9592f699892df064889ffde3382c484b65f683"/>
+    <w:bookmarkEnd w:id="39"/>
+    <w:bookmarkStart w:id="40" w:name="Xc1ab32383d88456487ad9e6a7fa6e0954f4d69e"/>
     <w:p>
       <w:pPr>
         <w:pStyle w:val="Heading2"/>
@@ -4145,7 +4359,7 @@
         <w:t xml:space="preserve"> </w:t>
       </w:r>
       <w:r>
-        <w:t xml:space="preserve">TRM §4.2’s 40 signal pins with power pads counted separately.</w:t>
+        <w:t xml:space="preserve">TRM §4.2's 40 signal pins with power pads counted separately.</w:t>
       </w:r>
     </w:p>
     <w:p>
@@ -4332,6 +4546,234 @@
       </w:r>
       <w:r>
         <w:t xml:space="preserve">TRM, GPIO, PWM, DMA, CLIC, and the new pin-out/floorplan document.</w:t>
+      </w:r>
+    </w:p>
+    <w:p>
+      <w:pPr>
+        <w:pStyle w:val="BlockText"/>
+      </w:pPr>
+      <w:r>
+        <w:rPr>
+          <w:bCs/>
+          <w:b/>
+        </w:rPr>
+        <w:t xml:space="preserve">Rev 2 (current) — ESP-NOW is RESTORED and REQUIRED.</w:t>
+      </w:r>
+      <w:r>
+        <w:t xml:space="preserve"> </w:t>
+      </w:r>
+      <w:r>
+        <w:t xml:space="preserve">Reverses Rev 1's cut.</w:t>
+      </w:r>
+      <w:r>
+        <w:t xml:space="preserve"> </w:t>
+      </w:r>
+      <w:r>
+        <w:rPr>
+          <w:bCs/>
+          <w:b/>
+        </w:rPr>
+        <w:t xml:space="preserve">Reason:</w:t>
+      </w:r>
+      <w:r>
+        <w:t xml:space="preserve"> </w:t>
+      </w:r>
+      <w:r>
+        <w:t xml:space="preserve">the ESP-NOW mesh is the neighbour-position source for APF collision</w:t>
+      </w:r>
+      <w:r>
+        <w:t xml:space="preserve"> </w:t>
+      </w:r>
+      <w:r>
+        <w:t xml:space="preserve">avoidance - the workload the DSU exists to accelerate. Without it the swarm feature has</w:t>
+      </w:r>
+      <w:r>
+        <w:t xml:space="preserve"> </w:t>
+      </w:r>
+      <w:r>
+        <w:t xml:space="preserve">no input, so it is NOT the "least essential system function" Rev 1 assumed; it is</w:t>
+      </w:r>
+      <w:r>
+        <w:t xml:space="preserve"> </w:t>
+      </w:r>
+      <w:r>
+        <w:t xml:space="preserve">load-bearing. The SPI-slave port (pins 29-32</w:t>
+      </w:r>
+      <w:r>
+        <w:t xml:space="preserve"> </w:t>
+      </w:r>
+      <w:r>
+        <w:rPr>
+          <w:rStyle w:val="VerbatimChar"/>
+        </w:rPr>
+        <w:t xml:space="preserve">spis_sclk/mosi/miso/cs_n</w:t>
+      </w:r>
+      <w:r>
+        <w:t xml:space="preserve">, block 14,</w:t>
+      </w:r>
+      <w:r>
+        <w:t xml:space="preserve"> </w:t>
+      </w:r>
+      <w:r>
+        <w:t xml:space="preserve">CLIC ID 14, DMA CH4) is reinstated.</w:t>
+      </w:r>
+    </w:p>
+    <w:p>
+      <w:pPr>
+        <w:pStyle w:val="BlockText"/>
+      </w:pPr>
+      <w:r>
+        <w:rPr>
+          <w:bCs/>
+          <w:b/>
+        </w:rPr>
+        <w:t xml:space="preserve">Pin plan - gated on OPEN-2 (still open; PD mentor's call against the pad frame):</w:t>
+      </w:r>
+    </w:p>
+    <w:p>
+      <w:pPr>
+        <w:numPr>
+          <w:ilvl w:val="0"/>
+          <w:numId w:val="1006"/>
+        </w:numPr>
+        <w:pStyle w:val="Compact"/>
+      </w:pPr>
+      <w:r>
+        <w:rPr>
+          <w:bCs/>
+          <w:b/>
+        </w:rPr>
+        <w:t xml:space="preserve">Supply pads OUTSIDE the 40</w:t>
+      </w:r>
+      <w:r>
+        <w:t xml:space="preserve"> </w:t>
+      </w:r>
+      <w:r>
+        <w:t xml:space="preserve">-&gt; the 4 pins are additive per PHYS §3.2; nothing in</w:t>
+      </w:r>
+      <w:r>
+        <w:t xml:space="preserve"> </w:t>
+      </w:r>
+      <w:r>
+        <w:t xml:space="preserve">the 28-pin allocation moves. Result: 30 signal pins used.</w:t>
+      </w:r>
+    </w:p>
+    <w:p>
+      <w:pPr>
+        <w:numPr>
+          <w:ilvl w:val="0"/>
+          <w:numId w:val="1006"/>
+        </w:numPr>
+        <w:pStyle w:val="Compact"/>
+      </w:pPr>
+      <w:r>
+        <w:rPr>
+          <w:bCs/>
+          <w:b/>
+        </w:rPr>
+        <w:t xml:space="preserve">Supply pads INSIDE the 40</w:t>
+      </w:r>
+      <w:r>
+        <w:t xml:space="preserve"> </w:t>
+      </w:r>
+      <w:r>
+        <w:t xml:space="preserve">-&gt; reclaim 4 pins: the 2 spares + drop console UART2</w:t>
+      </w:r>
+      <w:r>
+        <w:t xml:space="preserve"> </w:t>
+      </w:r>
+      <w:r>
+        <w:t xml:space="preserve">(2 pins; DMA priority 0, nothing waits on it; console moves to the ground link at</w:t>
+      </w:r>
+      <w:r>
+        <w:t xml:space="preserve"> </w:t>
+      </w:r>
+      <w:r>
+        <w:t xml:space="preserve">bring-up). Alternative: ESP32 on the SPI-master bus as a 3rd chip-select (1 pin,</w:t>
+      </w:r>
+      <w:r>
+        <w:t xml:space="preserve"> </w:t>
+      </w:r>
+      <w:r>
+        <w:t xml:space="preserve">poll-mode) instead of the 4-pin slave port.</w:t>
+      </w:r>
+    </w:p>
+    <w:p>
+      <w:pPr>
+        <w:pStyle w:val="BlockText"/>
+      </w:pPr>
+      <w:r>
+        <w:t xml:space="preserve">This ADR does NOT resolve OPEN-2 - it states the decision (ESP-NOW required) and both</w:t>
+      </w:r>
+      <w:r>
+        <w:t xml:space="preserve"> </w:t>
+      </w:r>
+      <w:r>
+        <w:t xml:space="preserve">pin outcomes.</w:t>
+      </w:r>
+      <w:r>
+        <w:t xml:space="preserve"> </w:t>
+      </w:r>
+      <w:r>
+        <w:rPr>
+          <w:bCs/>
+          <w:b/>
+        </w:rPr>
+        <w:t xml:space="preserve">RTL work items:</w:t>
+      </w:r>
+      <w:r>
+        <w:t xml:space="preserve"> </w:t>
+      </w:r>
+      <w:r>
+        <w:t xml:space="preserve">build</w:t>
+      </w:r>
+      <w:r>
+        <w:t xml:space="preserve"> </w:t>
+      </w:r>
+      <w:r>
+        <w:rPr>
+          <w:rStyle w:val="VerbatimChar"/>
+        </w:rPr>
+        <w:t xml:space="preserve">rtl/spi_slave/</w:t>
+      </w:r>
+      <w:r>
+        <w:t xml:space="preserve">; un-tie</w:t>
+      </w:r>
+      <w:r>
+        <w:t xml:space="preserve"> </w:t>
+      </w:r>
+      <w:r>
+        <w:rPr>
+          <w:rStyle w:val="VerbatimChar"/>
+        </w:rPr>
+        <w:t xml:space="preserve">dma_req_i[4]</w:t>
+      </w:r>
+      <w:r>
+        <w:t xml:space="preserve"> </w:t>
+      </w:r>
+      <w:r>
+        <w:t xml:space="preserve">in</w:t>
+      </w:r>
+      <w:r>
+        <w:t xml:space="preserve"> </w:t>
+      </w:r>
+      <w:r>
+        <w:rPr>
+          <w:rStyle w:val="VerbatimChar"/>
+        </w:rPr>
+        <w:t xml:space="preserve">dma_top</w:t>
+      </w:r>
+      <w:r>
+        <w:t xml:space="preserve">/</w:t>
+      </w:r>
+      <w:r>
+        <w:rPr>
+          <w:rStyle w:val="VerbatimChar"/>
+        </w:rPr>
+        <w:t xml:space="preserve">soc_top</w:t>
+      </w:r>
+      <w:r>
+        <w:t xml:space="preserve">; pad-ring edit (PD).</w:t>
       </w:r>
     </w:p>
     <w:p>
@@ -4341,8 +4783,8 @@
         </w:pict>
       </w:r>
     </w:p>
-    <w:bookmarkEnd w:id="39"/>
-    <w:bookmarkStart w:id="40" w:name="Xb20f66b0860295dc6dabf4caabc3dd95b24f86e"/>
+    <w:bookmarkEnd w:id="40"/>
+    <w:bookmarkStart w:id="41" w:name="X30ff4c6fb20462154ab91b05d0899ca1b3deb7b"/>
     <w:p>
       <w:pPr>
         <w:pStyle w:val="Heading2"/>
@@ -4468,8 +4910,8 @@
         <w:t xml:space="preserve">MEM, CLKRST §9.4, TRM power section.</w:t>
       </w:r>
     </w:p>
-    <w:bookmarkEnd w:id="40"/>
-    <w:bookmarkStart w:id="41" w:name="open-items-all-closed"/>
+    <w:bookmarkEnd w:id="41"/>
+    <w:bookmarkStart w:id="42" w:name="open-items--all-closed"/>
     <w:p>
       <w:pPr>
         <w:pStyle w:val="Heading2"/>
@@ -4501,7 +4943,7 @@
     <w:tbl>
       <w:tblPr>
         <w:tblStyle w:val="Table"/>
-        <w:tblW w:type="pct" w:w="5000"/>
+        <w:tblW w:type="auto" w:w="0"/>
         <w:tblLook w:firstRow="1" w:lastRow="0" w:firstColumn="0" w:lastColumn="0" w:noHBand="0" w:noVBand="0" w:val="0020"/>
         <w:jc w:val="start"/>
       </w:tblPr>
@@ -5187,7 +5629,7 @@
         <w:t xml:space="preserve"> </w:t>
       </w:r>
       <w:r>
-        <w:t xml:space="preserve">RTL edit, because both are physical. If the programme’s pad-frame documentation later shows</w:t>
+        <w:t xml:space="preserve">RTL edit, because both are physical. If the programme's pad-frame documentation later shows</w:t>
       </w:r>
       <w:r>
         <w:t xml:space="preserve"> </w:t>
@@ -5202,8 +5644,8 @@
         <w:t xml:space="preserve">discovery, after the pad ring is fixed, would not be.</w:t>
       </w:r>
     </w:p>
-    <w:bookmarkEnd w:id="41"/>
-    <w:bookmarkStart w:id="42" w:name="rtl-delta-implied-by-this-adr-set"/>
+    <w:bookmarkEnd w:id="42"/>
+    <w:bookmarkStart w:id="43" w:name="rtl-delta-implied-by-this-adr-set"/>
     <w:p>
       <w:pPr>
         <w:pStyle w:val="Heading2"/>
@@ -5215,7 +5657,7 @@
     <w:tbl>
       <w:tblPr>
         <w:tblStyle w:val="Table"/>
-        <w:tblW w:type="pct" w:w="5000"/>
+        <w:tblW w:type="auto" w:w="0"/>
         <w:tblLook w:firstRow="1" w:lastRow="0" w:firstColumn="0" w:lastColumn="0" w:noHBand="0" w:noVBand="0" w:val="0020"/>
         <w:jc w:val="start"/>
       </w:tblPr>
@@ -6016,8 +6458,459 @@
         </w:tc>
       </w:tr>
     </w:tbl>
-    <w:bookmarkEnd w:id="42"/>
     <w:bookmarkEnd w:id="43"/>
+    <w:bookmarkStart w:id="44" w:name="errata-and-rulings-2026-09-19"/>
+    <w:p>
+      <w:pPr>
+        <w:pStyle w:val="Heading2"/>
+      </w:pPr>
+      <w:r>
+        <w:t xml:space="preserve">Errata and rulings (2026-09-19)</w:t>
+      </w:r>
+    </w:p>
+    <w:p>
+      <w:pPr>
+        <w:pStyle w:val="FirstParagraph"/>
+      </w:pPr>
+      <w:r>
+        <w:t xml:space="preserve">Contradictions inside the Rev 4.0 set were ruled on during RTL migration. The</w:t>
+      </w:r>
+      <w:r>
+        <w:t xml:space="preserve"> </w:t>
+      </w:r>
+      <w:r>
+        <w:t xml:space="preserve">rulings are recorded in</w:t>
+      </w:r>
+      <w:r>
+        <w:t xml:space="preserve"> </w:t>
+      </w:r>
+      <w:r>
+        <w:rPr>
+          <w:rStyle w:val="VerbatimChar"/>
+        </w:rPr>
+        <w:t xml:space="preserve">Docs/DECISIONS.md</w:t>
+      </w:r>
+      <w:r>
+        <w:t xml:space="preserve"> </w:t>
+      </w:r>
+      <w:r>
+        <w:t xml:space="preserve">D-4..D-13 and take precedence over</w:t>
+      </w:r>
+      <w:r>
+        <w:t xml:space="preserve"> </w:t>
+      </w:r>
+      <w:r>
+        <w:t xml:space="preserve">the text above where they differ:</w:t>
+      </w:r>
+    </w:p>
+    <w:tbl>
+      <w:tblPr>
+        <w:tblStyle w:val="Table"/>
+        <w:tblW w:type="auto" w:w="0"/>
+        <w:tblLook w:firstRow="1" w:lastRow="0" w:firstColumn="0" w:lastColumn="0" w:noHBand="0" w:noVBand="0" w:val="0020"/>
+        <w:jc w:val="start"/>
+      </w:tblPr>
+      <w:tblGrid>
+        <w:gridCol w:w="2640"/>
+        <w:gridCol w:w="2640"/>
+        <w:gridCol w:w="2640"/>
+      </w:tblGrid>
+      <w:tr>
+        <w:trPr>
+          <w:tblHeader w:val="true"/>
+        </w:trPr>
+        <w:tc>
+          <w:tcPr/>
+          <w:p>
+            <w:pPr>
+              <w:pStyle w:val="Compact"/>
+              <w:jc w:val="left"/>
+            </w:pPr>
+            <w:r>
+              <w:t xml:space="preserve">Ruling</w:t>
+            </w:r>
+          </w:p>
+        </w:tc>
+        <w:tc>
+          <w:tcPr/>
+          <w:p>
+            <w:pPr>
+              <w:pStyle w:val="Compact"/>
+              <w:jc w:val="left"/>
+            </w:pPr>
+            <w:r>
+              <w:t xml:space="preserve">Affects</w:t>
+            </w:r>
+          </w:p>
+        </w:tc>
+        <w:tc>
+          <w:tcPr/>
+          <w:p>
+            <w:pPr>
+              <w:pStyle w:val="Compact"/>
+              <w:jc w:val="left"/>
+            </w:pPr>
+            <w:r>
+              <w:t xml:space="preserve">Summary</w:t>
+            </w:r>
+          </w:p>
+        </w:tc>
+      </w:tr>
+      <w:tr>
+        <w:tc>
+          <w:tcPr/>
+          <w:p>
+            <w:pPr>
+              <w:pStyle w:val="Compact"/>
+              <w:jc w:val="left"/>
+            </w:pPr>
+            <w:r>
+              <w:t xml:space="preserve">D-5</w:t>
+            </w:r>
+          </w:p>
+        </w:tc>
+        <w:tc>
+          <w:tcPr/>
+          <w:p>
+            <w:pPr>
+              <w:pStyle w:val="Compact"/>
+              <w:jc w:val="left"/>
+            </w:pPr>
+            <w:r>
+              <w:t xml:space="preserve">ADR-0002, R1, R2</w:t>
+            </w:r>
+          </w:p>
+        </w:tc>
+        <w:tc>
+          <w:tcPr/>
+          <w:p>
+            <w:pPr>
+              <w:pStyle w:val="Compact"/>
+              <w:jc w:val="left"/>
+            </w:pPr>
+            <w:r>
+              <w:t xml:space="preserve">pclk exists (125 MHz, synchronous); APB register interfaces on pclk; DMA CDC deleted</w:t>
+            </w:r>
+          </w:p>
+        </w:tc>
+      </w:tr>
+      <w:tr>
+        <w:tc>
+          <w:tcPr/>
+          <w:p>
+            <w:pPr>
+              <w:pStyle w:val="Compact"/>
+              <w:jc w:val="left"/>
+            </w:pPr>
+            <w:r>
+              <w:t xml:space="preserve">D-6</w:t>
+            </w:r>
+          </w:p>
+        </w:tc>
+        <w:tc>
+          <w:tcPr/>
+          <w:p>
+            <w:pPr>
+              <w:pStyle w:val="Compact"/>
+              <w:jc w:val="left"/>
+            </w:pPr>
+            <w:r>
+              <w:t xml:space="preserve">AHB2APB [N-7.19]</w:t>
+            </w:r>
+          </w:p>
+        </w:tc>
+        <w:tc>
+          <w:tcPr/>
+          <w:p>
+            <w:pPr>
+              <w:pStyle w:val="Compact"/>
+              <w:jc w:val="left"/>
+            </w:pPr>
+            <w:r>
+              <w:t xml:space="preserve">Window n =</w:t>
+            </w:r>
+            <w:r>
+              <w:t xml:space="preserve"> </w:t>
+            </w:r>
+            <w:r>
+              <w:rPr>
+                <w:rStyle w:val="VerbatimChar"/>
+              </w:rPr>
+              <w:t xml:space="preserve">0x4000_0000 + 0x1000·n</w:t>
+            </w:r>
+            <w:r>
+              <w:t xml:space="preserve">; unmapped = 0x0, 0xC–0xF (0xB is timers)</w:t>
+            </w:r>
+          </w:p>
+        </w:tc>
+      </w:tr>
+      <w:tr>
+        <w:tc>
+          <w:tcPr/>
+          <w:p>
+            <w:pPr>
+              <w:pStyle w:val="Compact"/>
+              <w:jc w:val="left"/>
+            </w:pPr>
+            <w:r>
+              <w:t xml:space="preserve">D-7</w:t>
+            </w:r>
+          </w:p>
+        </w:tc>
+        <w:tc>
+          <w:tcPr/>
+          <w:p>
+            <w:pPr>
+              <w:pStyle w:val="Compact"/>
+              <w:jc w:val="left"/>
+            </w:pPr>
+            <w:r>
+              <w:t xml:space="preserve">ADR-0005, DMA R-9</w:t>
+            </w:r>
+          </w:p>
+        </w:tc>
+        <w:tc>
+          <w:tcPr/>
+          <w:p>
+            <w:pPr>
+              <w:pStyle w:val="Compact"/>
+              <w:jc w:val="left"/>
+            </w:pPr>
+            <w:r>
+              <w:t xml:space="preserve">Decode is the only reachability gate</w:t>
+            </w:r>
+          </w:p>
+        </w:tc>
+      </w:tr>
+      <w:tr>
+        <w:tc>
+          <w:tcPr/>
+          <w:p>
+            <w:pPr>
+              <w:pStyle w:val="Compact"/>
+              <w:jc w:val="left"/>
+            </w:pPr>
+            <w:r>
+              <w:t xml:space="preserve">D-8</w:t>
+            </w:r>
+          </w:p>
+        </w:tc>
+        <w:tc>
+          <w:tcPr/>
+          <w:p>
+            <w:pPr>
+              <w:pStyle w:val="Compact"/>
+              <w:jc w:val="left"/>
+            </w:pPr>
+            <w:r>
+              <w:t xml:space="preserve">ADR-0003, ADR-0019</w:t>
+            </w:r>
+          </w:p>
+        </w:tc>
+        <w:tc>
+          <w:tcPr/>
+          <w:p>
+            <w:pPr>
+              <w:pStyle w:val="Compact"/>
+              <w:jc w:val="left"/>
+            </w:pPr>
+            <w:r>
+              <w:rPr>
+                <w:rStyle w:val="VerbatimChar"/>
+              </w:rPr>
+              <w:t xml:space="preserve">RSTREASON</w:t>
+            </w:r>
+            <w:r>
+              <w:t xml:space="preserve"> </w:t>
+            </w:r>
+            <w:r>
+              <w:t xml:space="preserve">layout per CLKRST §6.1; cleared only by</w:t>
+            </w:r>
+            <w:r>
+              <w:t xml:space="preserve"> </w:t>
+            </w:r>
+            <w:r>
+              <w:rPr>
+                <w:rStyle w:val="VerbatimChar"/>
+              </w:rPr>
+              <w:t xml:space="preserve">ext_rst_n</w:t>
+            </w:r>
+          </w:p>
+        </w:tc>
+      </w:tr>
+      <w:tr>
+        <w:tc>
+          <w:tcPr/>
+          <w:p>
+            <w:pPr>
+              <w:pStyle w:val="Compact"/>
+              <w:jc w:val="left"/>
+            </w:pPr>
+            <w:r>
+              <w:t xml:space="preserve">D-9</w:t>
+            </w:r>
+          </w:p>
+        </w:tc>
+        <w:tc>
+          <w:tcPr/>
+          <w:p>
+            <w:pPr>
+              <w:pStyle w:val="Compact"/>
+              <w:jc w:val="left"/>
+            </w:pPr>
+            <w:r>
+              <w:t xml:space="preserve">ADR-0003, DEBUG [N-7.14]</w:t>
+            </w:r>
+          </w:p>
+        </w:tc>
+        <w:tc>
+          <w:tcPr/>
+          <w:p>
+            <w:pPr>
+              <w:pStyle w:val="Compact"/>
+              <w:jc w:val="left"/>
+            </w:pPr>
+            <w:r>
+              <w:t xml:space="preserve">1024-refclk stretch for every source incl. ndmreset; DM/TAP on a separate reset</w:t>
+            </w:r>
+          </w:p>
+        </w:tc>
+      </w:tr>
+      <w:tr>
+        <w:tc>
+          <w:tcPr/>
+          <w:p>
+            <w:pPr>
+              <w:pStyle w:val="Compact"/>
+              <w:jc w:val="left"/>
+            </w:pPr>
+            <w:r>
+              <w:t xml:space="preserve">D-10</w:t>
+            </w:r>
+          </w:p>
+        </w:tc>
+        <w:tc>
+          <w:tcPr/>
+          <w:p>
+            <w:pPr>
+              <w:pStyle w:val="Compact"/>
+              <w:jc w:val="left"/>
+            </w:pPr>
+            <w:r>
+              <w:t xml:space="preserve">ADR-0013</w:t>
+            </w:r>
+          </w:p>
+        </w:tc>
+        <w:tc>
+          <w:tcPr/>
+          <w:p>
+            <w:pPr>
+              <w:pStyle w:val="Compact"/>
+              <w:jc w:val="left"/>
+            </w:pPr>
+            <w:r>
+              <w:t xml:space="preserve">Superseded by ADR-0020</w:t>
+            </w:r>
+          </w:p>
+        </w:tc>
+      </w:tr>
+      <w:tr>
+        <w:tc>
+          <w:tcPr/>
+          <w:p>
+            <w:pPr>
+              <w:pStyle w:val="Compact"/>
+              <w:jc w:val="left"/>
+            </w:pPr>
+            <w:r>
+              <w:t xml:space="preserve">D-11</w:t>
+            </w:r>
+          </w:p>
+        </w:tc>
+        <w:tc>
+          <w:tcPr/>
+          <w:p>
+            <w:pPr>
+              <w:pStyle w:val="Compact"/>
+              <w:jc w:val="left"/>
+            </w:pPr>
+            <w:r>
+              <w:t xml:space="preserve">yaml</w:t>
+            </w:r>
+            <w:r>
+              <w:t xml:space="preserve"> </w:t>
+            </w:r>
+            <w:r>
+              <w:rPr>
+                <w:rStyle w:val="VerbatimChar"/>
+              </w:rPr>
+              <w:t xml:space="preserve">boot.sequence</w:t>
+            </w:r>
+          </w:p>
+        </w:tc>
+        <w:tc>
+          <w:tcPr/>
+          <w:p>
+            <w:pPr>
+              <w:pStyle w:val="Compact"/>
+              <w:jc w:val="left"/>
+            </w:pPr>
+            <w:r>
+              <w:t xml:space="preserve">MEM §8.1 32-byte header is normative</w:t>
+            </w:r>
+          </w:p>
+        </w:tc>
+      </w:tr>
+      <w:tr>
+        <w:tc>
+          <w:tcPr/>
+          <w:p>
+            <w:pPr>
+              <w:pStyle w:val="Compact"/>
+              <w:jc w:val="left"/>
+            </w:pPr>
+            <w:r>
+              <w:t xml:space="preserve">D-12</w:t>
+            </w:r>
+          </w:p>
+        </w:tc>
+        <w:tc>
+          <w:tcPr/>
+          <w:p>
+            <w:pPr>
+              <w:pStyle w:val="Compact"/>
+              <w:jc w:val="left"/>
+            </w:pPr>
+            <w:r>
+              <w:t xml:space="preserve">yaml</w:t>
+            </w:r>
+            <w:r>
+              <w:t xml:space="preserve"> </w:t>
+            </w:r>
+            <w:r>
+              <w:rPr>
+                <w:rStyle w:val="VerbatimChar"/>
+              </w:rPr>
+              <w:t xml:space="preserve">dsu.instructions</w:t>
+            </w:r>
+          </w:p>
+        </w:tc>
+        <w:tc>
+          <w:tcPr/>
+          <w:p>
+            <w:pPr>
+              <w:pStyle w:val="Compact"/>
+              <w:jc w:val="left"/>
+            </w:pPr>
+            <w:r>
+              <w:t xml:space="preserve">RTL decoder is normative</w:t>
+            </w:r>
+          </w:p>
+        </w:tc>
+      </w:tr>
+    </w:tbl>
+    <w:bookmarkEnd w:id="44"/>
+    <w:bookmarkEnd w:id="45"/>
     <w:sectPr/>
   </w:body>
 </w:document>
@@ -6124,8 +7017,295 @@
       </w:pPr>
     </w:lvl>
   </w:abstractNum>
+  <w:abstractNum w:abstractNumId="99411">
+    <w:nsid w:val="A99411"/>
+    <w:multiLevelType w:val="multilevel"/>
+    <w:lvl w:ilvl="0">
+      <w:start w:val="1"/>
+      <w:numFmt w:val="decimal"/>
+      <w:lvlText w:val="%1."/>
+      <w:lvlJc w:val="left"/>
+      <w:pPr>
+        <w:ind w:left="720" w:hanging="480"/>
+      </w:pPr>
+    </w:lvl>
+    <w:lvl w:ilvl="1">
+      <w:start w:val="1"/>
+      <w:numFmt w:val="decimal"/>
+      <w:lvlText w:val="%2."/>
+      <w:lvlJc w:val="left"/>
+      <w:pPr>
+        <w:ind w:left="1440" w:hanging="480"/>
+      </w:pPr>
+    </w:lvl>
+    <w:lvl w:ilvl="2">
+      <w:start w:val="1"/>
+      <w:numFmt w:val="decimal"/>
+      <w:lvlText w:val="%3."/>
+      <w:lvlJc w:val="left"/>
+      <w:pPr>
+        <w:ind w:left="2160" w:hanging="480"/>
+      </w:pPr>
+    </w:lvl>
+    <w:lvl w:ilvl="3">
+      <w:start w:val="1"/>
+      <w:numFmt w:val="decimal"/>
+      <w:lvlText w:val="%4."/>
+      <w:lvlJc w:val="left"/>
+      <w:pPr>
+        <w:ind w:left="2880" w:hanging="480"/>
+      </w:pPr>
+    </w:lvl>
+    <w:lvl w:ilvl="4">
+      <w:start w:val="1"/>
+      <w:numFmt w:val="decimal"/>
+      <w:lvlText w:val="%5."/>
+      <w:lvlJc w:val="left"/>
+      <w:pPr>
+        <w:ind w:left="3600" w:hanging="480"/>
+      </w:pPr>
+    </w:lvl>
+    <w:lvl w:ilvl="5">
+      <w:start w:val="1"/>
+      <w:numFmt w:val="decimal"/>
+      <w:lvlText w:val="%6."/>
+      <w:lvlJc w:val="left"/>
+      <w:pPr>
+        <w:ind w:left="4320" w:hanging="480"/>
+      </w:pPr>
+    </w:lvl>
+    <w:lvl w:ilvl="6">
+      <w:start w:val="1"/>
+      <w:numFmt w:val="decimal"/>
+      <w:lvlText w:val="%7."/>
+      <w:lvlJc w:val="left"/>
+      <w:pPr>
+        <w:ind w:left="5040" w:hanging="480"/>
+      </w:pPr>
+    </w:lvl>
+    <w:lvl w:ilvl="7">
+      <w:start w:val="1"/>
+      <w:numFmt w:val="decimal"/>
+      <w:lvlText w:val="%8."/>
+      <w:lvlJc w:val="left"/>
+      <w:pPr>
+        <w:ind w:left="5760" w:hanging="480"/>
+      </w:pPr>
+    </w:lvl>
+    <w:lvl w:ilvl="8">
+      <w:start w:val="1"/>
+      <w:numFmt w:val="decimal"/>
+      <w:lvlText w:val="%9."/>
+      <w:lvlJc w:val="left"/>
+      <w:pPr>
+        <w:ind w:left="6480" w:hanging="480"/>
+      </w:pPr>
+    </w:lvl>
+  </w:abstractNum>
+  <w:abstractNum w:abstractNumId="991">
+    <w:nsid w:val="A991"/>
+    <w:multiLevelType w:val="multilevel"/>
+    <w:lvl w:ilvl="0">
+      <w:numFmt w:val="bullet"/>
+      <w:lvlText w:val="•"/>
+      <w:lvlJc w:val="left"/>
+      <w:pPr>
+        <w:ind w:left="720" w:hanging="480"/>
+      </w:pPr>
+    </w:lvl>
+    <w:lvl w:ilvl="1">
+      <w:numFmt w:val="bullet"/>
+      <w:lvlText w:val="–"/>
+      <w:lvlJc w:val="left"/>
+      <w:pPr>
+        <w:ind w:left="1440" w:hanging="480"/>
+      </w:pPr>
+    </w:lvl>
+    <w:lvl w:ilvl="2">
+      <w:numFmt w:val="bullet"/>
+      <w:lvlText w:val="•"/>
+      <w:lvlJc w:val="left"/>
+      <w:pPr>
+        <w:ind w:left="2160" w:hanging="480"/>
+      </w:pPr>
+    </w:lvl>
+    <w:lvl w:ilvl="3">
+      <w:numFmt w:val="bullet"/>
+      <w:lvlText w:val="–"/>
+      <w:lvlJc w:val="left"/>
+      <w:pPr>
+        <w:ind w:left="2880" w:hanging="480"/>
+      </w:pPr>
+    </w:lvl>
+    <w:lvl w:ilvl="4">
+      <w:numFmt w:val="bullet"/>
+      <w:lvlText w:val="•"/>
+      <w:lvlJc w:val="left"/>
+      <w:pPr>
+        <w:ind w:left="3600" w:hanging="480"/>
+      </w:pPr>
+    </w:lvl>
+    <w:lvl w:ilvl="5">
+      <w:numFmt w:val="bullet"/>
+      <w:lvlText w:val="–"/>
+      <w:lvlJc w:val="left"/>
+      <w:pPr>
+        <w:ind w:left="4320" w:hanging="480"/>
+      </w:pPr>
+    </w:lvl>
+    <w:lvl w:ilvl="6">
+      <w:numFmt w:val="bullet"/>
+      <w:lvlText w:val="•"/>
+      <w:lvlJc w:val="left"/>
+      <w:pPr>
+        <w:ind w:left="5040" w:hanging="480"/>
+      </w:pPr>
+    </w:lvl>
+    <w:lvl w:ilvl="7">
+      <w:numFmt w:val="bullet"/>
+      <w:lvlText w:val="–"/>
+      <w:lvlJc w:val="left"/>
+      <w:pPr>
+        <w:ind w:left="5760" w:hanging="480"/>
+      </w:pPr>
+    </w:lvl>
+    <w:lvl w:ilvl="8">
+      <w:numFmt w:val="bullet"/>
+      <w:lvlText w:val="•"/>
+      <w:lvlJc w:val="left"/>
+      <w:pPr>
+        <w:ind w:left="6480" w:hanging="480"/>
+      </w:pPr>
+    </w:lvl>
+  </w:abstractNum>
   <w:num w:numId="1000">
     <w:abstractNumId w:val="990"/>
+  </w:num>
+  <w:num w:numId="1001">
+    <w:abstractNumId w:val="99411"/>
+    <w:lvlOverride w:ilvl="0">
+      <w:startOverride w:val="1"/>
+    </w:lvlOverride>
+    <w:lvlOverride w:ilvl="1">
+      <w:startOverride w:val="1"/>
+    </w:lvlOverride>
+    <w:lvlOverride w:ilvl="2">
+      <w:startOverride w:val="1"/>
+    </w:lvlOverride>
+    <w:lvlOverride w:ilvl="3">
+      <w:startOverride w:val="1"/>
+    </w:lvlOverride>
+    <w:lvlOverride w:ilvl="4">
+      <w:startOverride w:val="1"/>
+    </w:lvlOverride>
+    <w:lvlOverride w:ilvl="5">
+      <w:startOverride w:val="1"/>
+    </w:lvlOverride>
+    <w:lvlOverride w:ilvl="6">
+      <w:startOverride w:val="1"/>
+    </w:lvlOverride>
+    <w:lvlOverride w:ilvl="7">
+      <w:startOverride w:val="1"/>
+    </w:lvlOverride>
+    <w:lvlOverride w:ilvl="8">
+      <w:startOverride w:val="1"/>
+    </w:lvlOverride>
+  </w:num>
+  <w:num w:numId="1002">
+    <w:abstractNumId w:val="99411"/>
+    <w:lvlOverride w:ilvl="0">
+      <w:startOverride w:val="1"/>
+    </w:lvlOverride>
+    <w:lvlOverride w:ilvl="1">
+      <w:startOverride w:val="1"/>
+    </w:lvlOverride>
+    <w:lvlOverride w:ilvl="2">
+      <w:startOverride w:val="1"/>
+    </w:lvlOverride>
+    <w:lvlOverride w:ilvl="3">
+      <w:startOverride w:val="1"/>
+    </w:lvlOverride>
+    <w:lvlOverride w:ilvl="4">
+      <w:startOverride w:val="1"/>
+    </w:lvlOverride>
+    <w:lvlOverride w:ilvl="5">
+      <w:startOverride w:val="1"/>
+    </w:lvlOverride>
+    <w:lvlOverride w:ilvl="6">
+      <w:startOverride w:val="1"/>
+    </w:lvlOverride>
+    <w:lvlOverride w:ilvl="7">
+      <w:startOverride w:val="1"/>
+    </w:lvlOverride>
+    <w:lvlOverride w:ilvl="8">
+      <w:startOverride w:val="1"/>
+    </w:lvlOverride>
+  </w:num>
+  <w:num w:numId="1003">
+    <w:abstractNumId w:val="99411"/>
+    <w:lvlOverride w:ilvl="0">
+      <w:startOverride w:val="1"/>
+    </w:lvlOverride>
+    <w:lvlOverride w:ilvl="1">
+      <w:startOverride w:val="1"/>
+    </w:lvlOverride>
+    <w:lvlOverride w:ilvl="2">
+      <w:startOverride w:val="1"/>
+    </w:lvlOverride>
+    <w:lvlOverride w:ilvl="3">
+      <w:startOverride w:val="1"/>
+    </w:lvlOverride>
+    <w:lvlOverride w:ilvl="4">
+      <w:startOverride w:val="1"/>
+    </w:lvlOverride>
+    <w:lvlOverride w:ilvl="5">
+      <w:startOverride w:val="1"/>
+    </w:lvlOverride>
+    <w:lvlOverride w:ilvl="6">
+      <w:startOverride w:val="1"/>
+    </w:lvlOverride>
+    <w:lvlOverride w:ilvl="7">
+      <w:startOverride w:val="1"/>
+    </w:lvlOverride>
+    <w:lvlOverride w:ilvl="8">
+      <w:startOverride w:val="1"/>
+    </w:lvlOverride>
+  </w:num>
+  <w:num w:numId="1004">
+    <w:abstractNumId w:val="991"/>
+  </w:num>
+  <w:num w:numId="1005">
+    <w:abstractNumId w:val="99411"/>
+    <w:lvlOverride w:ilvl="0">
+      <w:startOverride w:val="1"/>
+    </w:lvlOverride>
+    <w:lvlOverride w:ilvl="1">
+      <w:startOverride w:val="1"/>
+    </w:lvlOverride>
+    <w:lvlOverride w:ilvl="2">
+      <w:startOverride w:val="1"/>
+    </w:lvlOverride>
+    <w:lvlOverride w:ilvl="3">
+      <w:startOverride w:val="1"/>
+    </w:lvlOverride>
+    <w:lvlOverride w:ilvl="4">
+      <w:startOverride w:val="1"/>
+    </w:lvlOverride>
+    <w:lvlOverride w:ilvl="5">
+      <w:startOverride w:val="1"/>
+    </w:lvlOverride>
+    <w:lvlOverride w:ilvl="6">
+      <w:startOverride w:val="1"/>
+    </w:lvlOverride>
+    <w:lvlOverride w:ilvl="7">
+      <w:startOverride w:val="1"/>
+    </w:lvlOverride>
+    <w:lvlOverride w:ilvl="8">
+      <w:startOverride w:val="1"/>
+    </w:lvlOverride>
+  </w:num>
+  <w:num w:numId="1006">
+    <w:abstractNumId w:val="991"/>
   </w:num>
 </w:numbering>
 </file>
@@ -6616,7 +7796,7 @@
       <w:color w:themeColor="accent1" w:themeShade="BF" w:val="365F91"/>
     </w:rPr>
   </w:style>
-  <w:style w:type="paragraph" w:customStyle="1" w:styleId="SourceCode">
+  <w:style w:customStyle="1" w:styleId="SourceCode" w:type="paragraph">
     <w:name w:val="Source Code"/>
     <w:basedOn w:val="Normal"/>
     <w:link w:val="VerbatimChar"/>
@@ -6624,7 +7804,7 @@
       <w:wordWrap w:val="off"/>
     </w:pPr>
   </w:style>
-  <w:style w:type="character" w:customStyle="1" w:styleId="KeywordTok">
+  <w:style w:customStyle="1" w:styleId="KeywordTok" w:type="character">
     <w:name w:val="KeywordTok"/>
     <w:basedOn w:val="VerbatimChar"/>
     <w:rPr>
@@ -6632,77 +7812,77 @@
       <w:b/>
     </w:rPr>
   </w:style>
-  <w:style w:type="character" w:customStyle="1" w:styleId="DataTypeTok">
+  <w:style w:customStyle="1" w:styleId="DataTypeTok" w:type="character">
     <w:name w:val="DataTypeTok"/>
     <w:basedOn w:val="VerbatimChar"/>
     <w:rPr>
       <w:color w:val="902000"/>
     </w:rPr>
   </w:style>
-  <w:style w:type="character" w:customStyle="1" w:styleId="DecValTok">
+  <w:style w:customStyle="1" w:styleId="DecValTok" w:type="character">
     <w:name w:val="DecValTok"/>
     <w:basedOn w:val="VerbatimChar"/>
     <w:rPr>
       <w:color w:val="40a070"/>
     </w:rPr>
   </w:style>
-  <w:style w:type="character" w:customStyle="1" w:styleId="BaseNTok">
+  <w:style w:customStyle="1" w:styleId="BaseNTok" w:type="character">
     <w:name w:val="BaseNTok"/>
     <w:basedOn w:val="VerbatimChar"/>
     <w:rPr>
       <w:color w:val="40a070"/>
     </w:rPr>
   </w:style>
-  <w:style w:type="character" w:customStyle="1" w:styleId="FloatTok">
+  <w:style w:customStyle="1" w:styleId="FloatTok" w:type="character">
     <w:name w:val="FloatTok"/>
     <w:basedOn w:val="VerbatimChar"/>
     <w:rPr>
       <w:color w:val="40a070"/>
     </w:rPr>
   </w:style>
-  <w:style w:type="character" w:customStyle="1" w:styleId="ConstantTok">
+  <w:style w:customStyle="1" w:styleId="ConstantTok" w:type="character">
     <w:name w:val="ConstantTok"/>
     <w:basedOn w:val="VerbatimChar"/>
     <w:rPr>
       <w:color w:val="880000"/>
     </w:rPr>
   </w:style>
-  <w:style w:type="character" w:customStyle="1" w:styleId="CharTok">
+  <w:style w:customStyle="1" w:styleId="CharTok" w:type="character">
     <w:name w:val="CharTok"/>
     <w:basedOn w:val="VerbatimChar"/>
     <w:rPr>
       <w:color w:val="4070a0"/>
     </w:rPr>
   </w:style>
-  <w:style w:type="character" w:customStyle="1" w:styleId="SpecialCharTok">
+  <w:style w:customStyle="1" w:styleId="SpecialCharTok" w:type="character">
     <w:name w:val="SpecialCharTok"/>
     <w:basedOn w:val="VerbatimChar"/>
     <w:rPr>
       <w:color w:val="4070a0"/>
     </w:rPr>
   </w:style>
-  <w:style w:type="character" w:customStyle="1" w:styleId="StringTok">
+  <w:style w:customStyle="1" w:styleId="StringTok" w:type="character">
     <w:name w:val="StringTok"/>
     <w:basedOn w:val="VerbatimChar"/>
     <w:rPr>
       <w:color w:val="4070a0"/>
     </w:rPr>
   </w:style>
-  <w:style w:type="character" w:customStyle="1" w:styleId="VerbatimStringTok">
+  <w:style w:customStyle="1" w:styleId="VerbatimStringTok" w:type="character">
     <w:name w:val="VerbatimStringTok"/>
     <w:basedOn w:val="VerbatimChar"/>
     <w:rPr>
       <w:color w:val="4070a0"/>
     </w:rPr>
   </w:style>
-  <w:style w:type="character" w:customStyle="1" w:styleId="SpecialStringTok">
+  <w:style w:customStyle="1" w:styleId="SpecialStringTok" w:type="character">
     <w:name w:val="SpecialStringTok"/>
     <w:basedOn w:val="VerbatimChar"/>
     <w:rPr>
       <w:color w:val="bb6688"/>
     </w:rPr>
   </w:style>
-  <w:style w:type="character" w:customStyle="1" w:styleId="ImportTok">
+  <w:style w:customStyle="1" w:styleId="ImportTok" w:type="character">
     <w:name w:val="ImportTok"/>
     <w:basedOn w:val="VerbatimChar"/>
     <w:rPr>
@@ -6710,7 +7890,7 @@
       <w:b/>
     </w:rPr>
   </w:style>
-  <w:style w:type="character" w:customStyle="1" w:styleId="CommentTok">
+  <w:style w:customStyle="1" w:styleId="CommentTok" w:type="character">
     <w:name w:val="CommentTok"/>
     <w:basedOn w:val="VerbatimChar"/>
     <w:rPr>
@@ -6718,7 +7898,7 @@
       <w:i/>
     </w:rPr>
   </w:style>
-  <w:style w:type="character" w:customStyle="1" w:styleId="DocumentationTok">
+  <w:style w:customStyle="1" w:styleId="DocumentationTok" w:type="character">
     <w:name w:val="DocumentationTok"/>
     <w:basedOn w:val="VerbatimChar"/>
     <w:rPr>
@@ -6726,7 +7906,7 @@
       <w:i/>
     </w:rPr>
   </w:style>
-  <w:style w:type="character" w:customStyle="1" w:styleId="AnnotationTok">
+  <w:style w:customStyle="1" w:styleId="AnnotationTok" w:type="character">
     <w:name w:val="AnnotationTok"/>
     <w:basedOn w:val="VerbatimChar"/>
     <w:rPr>
@@ -6735,7 +7915,7 @@
       <w:i/>
     </w:rPr>
   </w:style>
-  <w:style w:type="character" w:customStyle="1" w:styleId="CommentVarTok">
+  <w:style w:customStyle="1" w:styleId="CommentVarTok" w:type="character">
     <w:name w:val="CommentVarTok"/>
     <w:basedOn w:val="VerbatimChar"/>
     <w:rPr>
@@ -6744,28 +7924,28 @@
       <w:i/>
     </w:rPr>
   </w:style>
-  <w:style w:type="character" w:customStyle="1" w:styleId="OtherTok">
+  <w:style w:customStyle="1" w:styleId="OtherTok" w:type="character">
     <w:name w:val="OtherTok"/>
     <w:basedOn w:val="VerbatimChar"/>
     <w:rPr>
       <w:color w:val="007020"/>
     </w:rPr>
   </w:style>
-  <w:style w:type="character" w:customStyle="1" w:styleId="FunctionTok">
+  <w:style w:customStyle="1" w:styleId="FunctionTok" w:type="character">
     <w:name w:val="FunctionTok"/>
     <w:basedOn w:val="VerbatimChar"/>
     <w:rPr>
       <w:color w:val="06287e"/>
     </w:rPr>
   </w:style>
-  <w:style w:type="character" w:customStyle="1" w:styleId="VariableTok">
+  <w:style w:customStyle="1" w:styleId="VariableTok" w:type="character">
     <w:name w:val="VariableTok"/>
     <w:basedOn w:val="VerbatimChar"/>
     <w:rPr>
       <w:color w:val="19177c"/>
     </w:rPr>
   </w:style>
-  <w:style w:type="character" w:customStyle="1" w:styleId="ControlFlowTok">
+  <w:style w:customStyle="1" w:styleId="ControlFlowTok" w:type="character">
     <w:name w:val="ControlFlowTok"/>
     <w:basedOn w:val="VerbatimChar"/>
     <w:rPr>
@@ -6773,45 +7953,45 @@
       <w:b/>
     </w:rPr>
   </w:style>
-  <w:style w:type="character" w:customStyle="1" w:styleId="OperatorTok">
+  <w:style w:customStyle="1" w:styleId="OperatorTok" w:type="character">
     <w:name w:val="OperatorTok"/>
     <w:basedOn w:val="VerbatimChar"/>
     <w:rPr>
       <w:color w:val="666666"/>
     </w:rPr>
   </w:style>
-  <w:style w:type="character" w:customStyle="1" w:styleId="BuiltInTok">
+  <w:style w:customStyle="1" w:styleId="BuiltInTok" w:type="character">
     <w:name w:val="BuiltInTok"/>
     <w:basedOn w:val="VerbatimChar"/>
     <w:rPr>
       <w:color w:val="008000"/>
     </w:rPr>
   </w:style>
-  <w:style w:type="character" w:customStyle="1" w:styleId="ExtensionTok">
+  <w:style w:customStyle="1" w:styleId="ExtensionTok" w:type="character">
     <w:name w:val="ExtensionTok"/>
     <w:basedOn w:val="VerbatimChar"/>
     <w:rPr/>
   </w:style>
-  <w:style w:type="character" w:customStyle="1" w:styleId="PreprocessorTok">
+  <w:style w:customStyle="1" w:styleId="PreprocessorTok" w:type="character">
     <w:name w:val="PreprocessorTok"/>
     <w:basedOn w:val="VerbatimChar"/>
     <w:rPr>
       <w:color w:val="bc7a00"/>
     </w:rPr>
   </w:style>
-  <w:style w:type="character" w:customStyle="1" w:styleId="AttributeTok">
+  <w:style w:customStyle="1" w:styleId="AttributeTok" w:type="character">
     <w:name w:val="AttributeTok"/>
     <w:basedOn w:val="VerbatimChar"/>
     <w:rPr>
       <w:color w:val="7d9029"/>
     </w:rPr>
   </w:style>
-  <w:style w:type="character" w:customStyle="1" w:styleId="RegionMarkerTok">
+  <w:style w:customStyle="1" w:styleId="RegionMarkerTok" w:type="character">
     <w:name w:val="RegionMarkerTok"/>
     <w:basedOn w:val="VerbatimChar"/>
     <w:rPr/>
   </w:style>
-  <w:style w:type="character" w:customStyle="1" w:styleId="InformationTok">
+  <w:style w:customStyle="1" w:styleId="InformationTok" w:type="character">
     <w:name w:val="InformationTok"/>
     <w:basedOn w:val="VerbatimChar"/>
     <w:rPr>
@@ -6820,7 +8000,7 @@
       <w:i/>
     </w:rPr>
   </w:style>
-  <w:style w:type="character" w:customStyle="1" w:styleId="WarningTok">
+  <w:style w:customStyle="1" w:styleId="WarningTok" w:type="character">
     <w:name w:val="WarningTok"/>
     <w:basedOn w:val="VerbatimChar"/>
     <w:rPr>
@@ -6829,7 +8009,7 @@
       <w:i/>
     </w:rPr>
   </w:style>
-  <w:style w:type="character" w:customStyle="1" w:styleId="AlertTok">
+  <w:style w:customStyle="1" w:styleId="AlertTok" w:type="character">
     <w:name w:val="AlertTok"/>
     <w:basedOn w:val="VerbatimChar"/>
     <w:rPr>
@@ -6837,7 +8017,7 @@
       <w:b/>
     </w:rPr>
   </w:style>
-  <w:style w:type="character" w:customStyle="1" w:styleId="ErrorTok">
+  <w:style w:customStyle="1" w:styleId="ErrorTok" w:type="character">
     <w:name w:val="ErrorTok"/>
     <w:basedOn w:val="VerbatimChar"/>
     <w:rPr>
@@ -6845,7 +8025,7 @@
       <w:b/>
     </w:rPr>
   </w:style>
-  <w:style w:type="character" w:customStyle="1" w:styleId="NormalTok">
+  <w:style w:customStyle="1" w:styleId="NormalTok" w:type="character">
     <w:name w:val="NormalTok"/>
     <w:basedOn w:val="VerbatimChar"/>
     <w:rPr/>

</xml_diff>